<commit_message>
Expand agent interview question bank
</commit_message>
<xml_diff>
--- a/docs/agent_interview_stage1_8/AI_Agent_Stage1_8_Interview_Guide.docx
+++ b/docs/agent_interview_stage1_8/AI_Agent_Stage1_8_Interview_Guide.docx
@@ -2401,6 +2401,625 @@
         <w:t>能否把自己的工作和 Stage 1-8 任意一个概念对应起来？</w:t>
       </w:r>
     </w:p>
+    <w:p>
+      <w:pPr>
+        <w:pStyle w:val="Heading1"/>
+      </w:pPr>
+      <w:r>
+        <w:t>十、扩展面试题库</w:t>
+      </w:r>
+    </w:p>
+    <w:tbl>
+      <w:tblPr>
+        <w:tblStyle w:val="TableGrid"/>
+        <w:tblW w:type="auto" w:w="0"/>
+        <w:jc w:val="center"/>
+        <w:tblLayout w:type="fixed"/>
+        <w:tblLook w:firstColumn="1" w:firstRow="1" w:lastColumn="0" w:lastRow="0" w:noHBand="0" w:noVBand="1" w:val="04A0"/>
+      </w:tblPr>
+      <w:tblGrid>
+        <w:gridCol w:w="4896"/>
+        <w:gridCol w:w="4896"/>
+      </w:tblGrid>
+      <w:tr>
+        <w:tc>
+          <w:tcPr>
+            <w:tcW w:type="dxa" w:w="1944"/>
+            <w:vAlign w:val="center"/>
+            <w:tcMar>
+              <w:top w:w="80" w:type="dxa"/>
+              <w:start w:w="120" w:type="dxa"/>
+              <w:bottom w:w="80" w:type="dxa"/>
+              <w:end w:w="120" w:type="dxa"/>
+            </w:tcMar>
+            <w:shd w:fill="E8EEF5"/>
+          </w:tcPr>
+          <w:p>
+            <w:pPr>
+              <w:jc w:val="left"/>
+            </w:pPr>
+            <w:r/>
+            <w:r>
+              <w:rPr>
+                <w:rFonts w:ascii="Calibri" w:hAnsi="Calibri"/>
+                <w:b/>
+                <w:color w:val="1F4D78"/>
+                <w:sz w:val="19"/>
+              </w:rPr>
+              <w:t>维度</w:t>
+            </w:r>
+          </w:p>
+        </w:tc>
+        <w:tc>
+          <w:tcPr>
+            <w:tcW w:type="dxa" w:w="7128"/>
+            <w:vAlign w:val="center"/>
+            <w:tcMar>
+              <w:top w:w="80" w:type="dxa"/>
+              <w:start w:w="120" w:type="dxa"/>
+              <w:bottom w:w="80" w:type="dxa"/>
+              <w:end w:w="120" w:type="dxa"/>
+            </w:tcMar>
+            <w:shd w:fill="E8EEF5"/>
+          </w:tcPr>
+          <w:p>
+            <w:pPr>
+              <w:jc w:val="left"/>
+            </w:pPr>
+            <w:r/>
+            <w:r>
+              <w:rPr>
+                <w:rFonts w:ascii="Calibri" w:hAnsi="Calibri"/>
+                <w:b/>
+                <w:color w:val="1F4D78"/>
+                <w:sz w:val="19"/>
+              </w:rPr>
+              <w:t>面试表达</w:t>
+            </w:r>
+          </w:p>
+        </w:tc>
+      </w:tr>
+      <w:tr>
+        <w:tc>
+          <w:tcPr>
+            <w:tcW w:type="dxa" w:w="4896"/>
+            <w:vAlign w:val="center"/>
+            <w:tcMar>
+              <w:top w:w="80" w:type="dxa"/>
+              <w:start w:w="120" w:type="dxa"/>
+              <w:bottom w:w="80" w:type="dxa"/>
+              <w:end w:w="120" w:type="dxa"/>
+            </w:tcMar>
+          </w:tcPr>
+          <w:p>
+            <w:pPr>
+              <w:jc w:val="left"/>
+            </w:pPr>
+            <w:r/>
+            <w:r>
+              <w:rPr>
+                <w:rFonts w:ascii="Calibri" w:hAnsi="Calibri"/>
+                <w:b/>
+                <w:sz w:val="19"/>
+              </w:rPr>
+              <w:t>Agent loop</w:t>
+            </w:r>
+          </w:p>
+        </w:tc>
+        <w:tc>
+          <w:tcPr>
+            <w:tcW w:type="dxa" w:w="4896"/>
+            <w:vAlign w:val="center"/>
+            <w:tcMar>
+              <w:top w:w="80" w:type="dxa"/>
+              <w:start w:w="120" w:type="dxa"/>
+              <w:bottom w:w="80" w:type="dxa"/>
+              <w:end w:w="120" w:type="dxa"/>
+            </w:tcMar>
+          </w:tcPr>
+          <w:p>
+            <w:pPr>
+              <w:jc w:val="left"/>
+            </w:pPr>
+            <w:r/>
+            <w:r>
+              <w:rPr>
+                <w:rFonts w:ascii="Calibri" w:hAnsi="Calibri"/>
+                <w:b w:val="0"/>
+                <w:sz w:val="19"/>
+              </w:rPr>
+              <w:t>问：如果工具失败，agent 应该直接停止还是重试？答：看失败类型。参数错误可修正重试，检索不足可改写 query，权限拒绝要人工确认，达到预算则停止。</w:t>
+            </w:r>
+          </w:p>
+        </w:tc>
+      </w:tr>
+      <w:tr>
+        <w:tc>
+          <w:tcPr>
+            <w:tcW w:type="dxa" w:w="4896"/>
+            <w:vAlign w:val="center"/>
+            <w:tcMar>
+              <w:top w:w="80" w:type="dxa"/>
+              <w:start w:w="120" w:type="dxa"/>
+              <w:bottom w:w="80" w:type="dxa"/>
+              <w:end w:w="120" w:type="dxa"/>
+            </w:tcMar>
+          </w:tcPr>
+          <w:p>
+            <w:pPr>
+              <w:jc w:val="left"/>
+            </w:pPr>
+            <w:r/>
+            <w:r>
+              <w:rPr>
+                <w:rFonts w:ascii="Calibri" w:hAnsi="Calibri"/>
+                <w:b/>
+                <w:sz w:val="19"/>
+              </w:rPr>
+              <w:t>WorkflowState</w:t>
+            </w:r>
+          </w:p>
+        </w:tc>
+        <w:tc>
+          <w:tcPr>
+            <w:tcW w:type="dxa" w:w="4896"/>
+            <w:vAlign w:val="center"/>
+            <w:tcMar>
+              <w:top w:w="80" w:type="dxa"/>
+              <w:start w:w="120" w:type="dxa"/>
+              <w:bottom w:w="80" w:type="dxa"/>
+              <w:end w:w="120" w:type="dxa"/>
+            </w:tcMar>
+          </w:tcPr>
+          <w:p>
+            <w:pPr>
+              <w:jc w:val="left"/>
+            </w:pPr>
+            <w:r/>
+            <w:r>
+              <w:rPr>
+                <w:rFonts w:ascii="Calibri" w:hAnsi="Calibri"/>
+                <w:b w:val="0"/>
+                <w:sz w:val="19"/>
+              </w:rPr>
+              <w:t>问：WorkflowState 为什么不直接用一串 messages？答：messages 难以稳定承载结构化字段，WorkflowState 能让计划、工具结果、证据、反思和结论可追踪、可测试。</w:t>
+            </w:r>
+          </w:p>
+        </w:tc>
+      </w:tr>
+      <w:tr>
+        <w:tc>
+          <w:tcPr>
+            <w:tcW w:type="dxa" w:w="4896"/>
+            <w:vAlign w:val="center"/>
+            <w:tcMar>
+              <w:top w:w="80" w:type="dxa"/>
+              <w:start w:w="120" w:type="dxa"/>
+              <w:bottom w:w="80" w:type="dxa"/>
+              <w:end w:w="120" w:type="dxa"/>
+            </w:tcMar>
+          </w:tcPr>
+          <w:p>
+            <w:pPr>
+              <w:jc w:val="left"/>
+            </w:pPr>
+            <w:r/>
+            <w:r>
+              <w:rPr>
+                <w:rFonts w:ascii="Calibri" w:hAnsi="Calibri"/>
+                <w:b/>
+                <w:sz w:val="19"/>
+              </w:rPr>
+              <w:t>证据链</w:t>
+            </w:r>
+          </w:p>
+        </w:tc>
+        <w:tc>
+          <w:tcPr>
+            <w:tcW w:type="dxa" w:w="4896"/>
+            <w:vAlign w:val="center"/>
+            <w:tcMar>
+              <w:top w:w="80" w:type="dxa"/>
+              <w:start w:w="120" w:type="dxa"/>
+              <w:bottom w:w="80" w:type="dxa"/>
+              <w:end w:w="120" w:type="dxa"/>
+            </w:tcMar>
+          </w:tcPr>
+          <w:p>
+            <w:pPr>
+              <w:jc w:val="left"/>
+            </w:pPr>
+            <w:r/>
+            <w:r>
+              <w:rPr>
+                <w:rFonts w:ascii="Calibri" w:hAnsi="Calibri"/>
+                <w:b w:val="0"/>
+                <w:sz w:val="19"/>
+              </w:rPr>
+              <w:t>问：证据链怎么设计？答：每个结论要绑定来源工具、原始结果、证据片段、置信信息和反思记录，报告只能引用状态中已有证据。</w:t>
+            </w:r>
+          </w:p>
+        </w:tc>
+      </w:tr>
+      <w:tr>
+        <w:tc>
+          <w:tcPr>
+            <w:tcW w:type="dxa" w:w="4896"/>
+            <w:vAlign w:val="center"/>
+            <w:tcMar>
+              <w:top w:w="80" w:type="dxa"/>
+              <w:start w:w="120" w:type="dxa"/>
+              <w:bottom w:w="80" w:type="dxa"/>
+              <w:end w:w="120" w:type="dxa"/>
+            </w:tcMar>
+          </w:tcPr>
+          <w:p>
+            <w:pPr>
+              <w:jc w:val="left"/>
+            </w:pPr>
+            <w:r/>
+            <w:r>
+              <w:rPr>
+                <w:rFonts w:ascii="Calibri" w:hAnsi="Calibri"/>
+                <w:b/>
+                <w:sz w:val="19"/>
+              </w:rPr>
+              <w:t>反思补查</w:t>
+            </w:r>
+          </w:p>
+        </w:tc>
+        <w:tc>
+          <w:tcPr>
+            <w:tcW w:type="dxa" w:w="4896"/>
+            <w:vAlign w:val="center"/>
+            <w:tcMar>
+              <w:top w:w="80" w:type="dxa"/>
+              <w:start w:w="120" w:type="dxa"/>
+              <w:bottom w:w="80" w:type="dxa"/>
+              <w:end w:w="120" w:type="dxa"/>
+            </w:tcMar>
+          </w:tcPr>
+          <w:p>
+            <w:pPr>
+              <w:jc w:val="left"/>
+            </w:pPr>
+            <w:r/>
+            <w:r>
+              <w:rPr>
+                <w:rFonts w:ascii="Calibri" w:hAnsi="Calibri"/>
+                <w:b w:val="0"/>
+                <w:sz w:val="19"/>
+              </w:rPr>
+              <w:t>问：什么时候触发 reflection？答：工具失败、证据不足、证据冲突、结论置信度低、报告缺少关键字段或命中 bad case 规则时。</w:t>
+            </w:r>
+          </w:p>
+        </w:tc>
+      </w:tr>
+      <w:tr>
+        <w:tc>
+          <w:tcPr>
+            <w:tcW w:type="dxa" w:w="4896"/>
+            <w:vAlign w:val="center"/>
+            <w:tcMar>
+              <w:top w:w="80" w:type="dxa"/>
+              <w:start w:w="120" w:type="dxa"/>
+              <w:bottom w:w="80" w:type="dxa"/>
+              <w:end w:w="120" w:type="dxa"/>
+            </w:tcMar>
+          </w:tcPr>
+          <w:p>
+            <w:pPr>
+              <w:jc w:val="left"/>
+            </w:pPr>
+            <w:r/>
+            <w:r>
+              <w:rPr>
+                <w:rFonts w:ascii="Calibri" w:hAnsi="Calibri"/>
+                <w:b/>
+                <w:sz w:val="19"/>
+              </w:rPr>
+              <w:t>RAG</w:t>
+            </w:r>
+          </w:p>
+        </w:tc>
+        <w:tc>
+          <w:tcPr>
+            <w:tcW w:type="dxa" w:w="4896"/>
+            <w:vAlign w:val="center"/>
+            <w:tcMar>
+              <w:top w:w="80" w:type="dxa"/>
+              <w:start w:w="120" w:type="dxa"/>
+              <w:bottom w:w="80" w:type="dxa"/>
+              <w:end w:w="120" w:type="dxa"/>
+            </w:tcMar>
+          </w:tcPr>
+          <w:p>
+            <w:pPr>
+              <w:jc w:val="left"/>
+            </w:pPr>
+            <w:r/>
+            <w:r>
+              <w:rPr>
+                <w:rFonts w:ascii="Calibri" w:hAnsi="Calibri"/>
+                <w:b w:val="0"/>
+                <w:sz w:val="19"/>
+              </w:rPr>
+              <w:t>问：RAG 召回不准怎么办？答：先看 query、chunk、top_k 和 citation；再做 query rewrite、embedding/hybrid search、rerank 或补充知识库。</w:t>
+            </w:r>
+          </w:p>
+        </w:tc>
+      </w:tr>
+      <w:tr>
+        <w:tc>
+          <w:tcPr>
+            <w:tcW w:type="dxa" w:w="4896"/>
+            <w:vAlign w:val="center"/>
+            <w:tcMar>
+              <w:top w:w="80" w:type="dxa"/>
+              <w:start w:w="120" w:type="dxa"/>
+              <w:bottom w:w="80" w:type="dxa"/>
+              <w:end w:w="120" w:type="dxa"/>
+            </w:tcMar>
+          </w:tcPr>
+          <w:p>
+            <w:pPr>
+              <w:jc w:val="left"/>
+            </w:pPr>
+            <w:r/>
+            <w:r>
+              <w:rPr>
+                <w:rFonts w:ascii="Calibri" w:hAnsi="Calibri"/>
+                <w:b/>
+                <w:sz w:val="19"/>
+              </w:rPr>
+              <w:t>Memory</w:t>
+            </w:r>
+          </w:p>
+        </w:tc>
+        <w:tc>
+          <w:tcPr>
+            <w:tcW w:type="dxa" w:w="4896"/>
+            <w:vAlign w:val="center"/>
+            <w:tcMar>
+              <w:top w:w="80" w:type="dxa"/>
+              <w:start w:w="120" w:type="dxa"/>
+              <w:bottom w:w="80" w:type="dxa"/>
+              <w:end w:w="120" w:type="dxa"/>
+            </w:tcMar>
+          </w:tcPr>
+          <w:p>
+            <w:pPr>
+              <w:jc w:val="left"/>
+            </w:pPr>
+            <w:r/>
+            <w:r>
+              <w:rPr>
+                <w:rFonts w:ascii="Calibri" w:hAnsi="Calibri"/>
+                <w:b w:val="0"/>
+                <w:sz w:val="19"/>
+              </w:rPr>
+              <w:t>问：什么信息不应该进长期记忆？答：临时日志、未验证猜测、敏感信息、一次性中间状态；长期记忆应保存可复用且可信的归因经验。</w:t>
+            </w:r>
+          </w:p>
+        </w:tc>
+      </w:tr>
+      <w:tr>
+        <w:tc>
+          <w:tcPr>
+            <w:tcW w:type="dxa" w:w="4896"/>
+            <w:vAlign w:val="center"/>
+            <w:tcMar>
+              <w:top w:w="80" w:type="dxa"/>
+              <w:start w:w="120" w:type="dxa"/>
+              <w:bottom w:w="80" w:type="dxa"/>
+              <w:end w:w="120" w:type="dxa"/>
+            </w:tcMar>
+          </w:tcPr>
+          <w:p>
+            <w:pPr>
+              <w:jc w:val="left"/>
+            </w:pPr>
+            <w:r/>
+            <w:r>
+              <w:rPr>
+                <w:rFonts w:ascii="Calibri" w:hAnsi="Calibri"/>
+                <w:b/>
+                <w:sz w:val="19"/>
+              </w:rPr>
+              <w:t>Eval</w:t>
+            </w:r>
+          </w:p>
+        </w:tc>
+        <w:tc>
+          <w:tcPr>
+            <w:tcW w:type="dxa" w:w="4896"/>
+            <w:vAlign w:val="center"/>
+            <w:tcMar>
+              <w:top w:w="80" w:type="dxa"/>
+              <w:start w:w="120" w:type="dxa"/>
+              <w:bottom w:w="80" w:type="dxa"/>
+              <w:end w:w="120" w:type="dxa"/>
+            </w:tcMar>
+          </w:tcPr>
+          <w:p>
+            <w:pPr>
+              <w:jc w:val="left"/>
+            </w:pPr>
+            <w:r/>
+            <w:r>
+              <w:rPr>
+                <w:rFonts w:ascii="Calibri" w:hAnsi="Calibri"/>
+                <w:b w:val="0"/>
+                <w:sz w:val="19"/>
+              </w:rPr>
+              <w:t>问：怎么证明 agent 变好了？答：用固定 eval 集比较成功率、失败分类、工具调用次数、延迟和人工复核通过率，而不是只展示 demo。</w:t>
+            </w:r>
+          </w:p>
+        </w:tc>
+      </w:tr>
+      <w:tr>
+        <w:tc>
+          <w:tcPr>
+            <w:tcW w:type="dxa" w:w="4896"/>
+            <w:vAlign w:val="center"/>
+            <w:tcMar>
+              <w:top w:w="80" w:type="dxa"/>
+              <w:start w:w="120" w:type="dxa"/>
+              <w:bottom w:w="80" w:type="dxa"/>
+              <w:end w:w="120" w:type="dxa"/>
+            </w:tcMar>
+          </w:tcPr>
+          <w:p>
+            <w:pPr>
+              <w:jc w:val="left"/>
+            </w:pPr>
+            <w:r/>
+            <w:r>
+              <w:rPr>
+                <w:rFonts w:ascii="Calibri" w:hAnsi="Calibri"/>
+                <w:b/>
+                <w:sz w:val="19"/>
+              </w:rPr>
+              <w:t>安全</w:t>
+            </w:r>
+          </w:p>
+        </w:tc>
+        <w:tc>
+          <w:tcPr>
+            <w:tcW w:type="dxa" w:w="4896"/>
+            <w:vAlign w:val="center"/>
+            <w:tcMar>
+              <w:top w:w="80" w:type="dxa"/>
+              <w:start w:w="120" w:type="dxa"/>
+              <w:bottom w:w="80" w:type="dxa"/>
+              <w:end w:w="120" w:type="dxa"/>
+            </w:tcMar>
+          </w:tcPr>
+          <w:p>
+            <w:pPr>
+              <w:jc w:val="left"/>
+            </w:pPr>
+            <w:r/>
+            <w:r>
+              <w:rPr>
+                <w:rFonts w:ascii="Calibri" w:hAnsi="Calibri"/>
+                <w:b w:val="0"/>
+                <w:sz w:val="19"/>
+              </w:rPr>
+              <w:t>问：哪些动作需要人工确认？答：写文件、删除、发送消息、提交表单、发布内容、支付、修改线上配置，以及任何不可逆或影响外部系统的动作。</w:t>
+            </w:r>
+          </w:p>
+        </w:tc>
+      </w:tr>
+      <w:tr>
+        <w:tc>
+          <w:tcPr>
+            <w:tcW w:type="dxa" w:w="4896"/>
+            <w:vAlign w:val="center"/>
+            <w:tcMar>
+              <w:top w:w="80" w:type="dxa"/>
+              <w:start w:w="120" w:type="dxa"/>
+              <w:bottom w:w="80" w:type="dxa"/>
+              <w:end w:w="120" w:type="dxa"/>
+            </w:tcMar>
+          </w:tcPr>
+          <w:p>
+            <w:pPr>
+              <w:jc w:val="left"/>
+            </w:pPr>
+            <w:r/>
+            <w:r>
+              <w:rPr>
+                <w:rFonts w:ascii="Calibri" w:hAnsi="Calibri"/>
+                <w:b/>
+                <w:sz w:val="19"/>
+              </w:rPr>
+              <w:t>Claude Code</w:t>
+            </w:r>
+          </w:p>
+        </w:tc>
+        <w:tc>
+          <w:tcPr>
+            <w:tcW w:type="dxa" w:w="4896"/>
+            <w:vAlign w:val="center"/>
+            <w:tcMar>
+              <w:top w:w="80" w:type="dxa"/>
+              <w:start w:w="120" w:type="dxa"/>
+              <w:bottom w:w="80" w:type="dxa"/>
+              <w:end w:w="120" w:type="dxa"/>
+            </w:tcMar>
+          </w:tcPr>
+          <w:p>
+            <w:pPr>
+              <w:jc w:val="left"/>
+            </w:pPr>
+            <w:r/>
+            <w:r>
+              <w:rPr>
+                <w:rFonts w:ascii="Calibri" w:hAnsi="Calibri"/>
+                <w:b w:val="0"/>
+                <w:sz w:val="19"/>
+              </w:rPr>
+              <w:t>问：Claude Code 辅助开发和项目 agent 有什么区别？答：Claude Code 是开发协作工具；项目 agent 是业务系统中的可执行归因链路，两者不要混为一谈。</w:t>
+            </w:r>
+          </w:p>
+        </w:tc>
+      </w:tr>
+      <w:tr>
+        <w:tc>
+          <w:tcPr>
+            <w:tcW w:type="dxa" w:w="4896"/>
+            <w:vAlign w:val="center"/>
+            <w:tcMar>
+              <w:top w:w="80" w:type="dxa"/>
+              <w:start w:w="120" w:type="dxa"/>
+              <w:bottom w:w="80" w:type="dxa"/>
+              <w:end w:w="120" w:type="dxa"/>
+            </w:tcMar>
+          </w:tcPr>
+          <w:p>
+            <w:pPr>
+              <w:jc w:val="left"/>
+            </w:pPr>
+            <w:r/>
+            <w:r>
+              <w:rPr>
+                <w:rFonts w:ascii="Calibri" w:hAnsi="Calibri"/>
+                <w:b/>
+                <w:sz w:val="19"/>
+              </w:rPr>
+              <w:t>工程落地</w:t>
+            </w:r>
+          </w:p>
+        </w:tc>
+        <w:tc>
+          <w:tcPr>
+            <w:tcW w:type="dxa" w:w="4896"/>
+            <w:vAlign w:val="center"/>
+            <w:tcMar>
+              <w:top w:w="80" w:type="dxa"/>
+              <w:start w:w="120" w:type="dxa"/>
+              <w:bottom w:w="80" w:type="dxa"/>
+              <w:end w:w="120" w:type="dxa"/>
+            </w:tcMar>
+          </w:tcPr>
+          <w:p>
+            <w:pPr>
+              <w:jc w:val="left"/>
+            </w:pPr>
+            <w:r/>
+            <w:r>
+              <w:rPr>
+                <w:rFonts w:ascii="Calibri" w:hAnsi="Calibri"/>
+                <w:b w:val="0"/>
+                <w:sz w:val="19"/>
+              </w:rPr>
+              <w:t>问：上线后怎么排查线上 bad case？答：用 trace + WorkflowState 回放，定位失败来自计划、工具、检索、反思、记忆还是报告生成。</w:t>
+            </w:r>
+          </w:p>
+        </w:tc>
+      </w:tr>
+    </w:tbl>
     <w:sectPr>
       <w:footerReference w:type="default" r:id="rId9"/>
       <w:pgSz w:w="12240" w:h="15840"/>

</xml_diff>

<commit_message>
Expand stage 1-8 interview guide details
</commit_message>
<xml_diff>
--- a/docs/agent_interview_stage1_8/AI_Agent_Stage1_8_Interview_Guide.docx
+++ b/docs/agent_interview_stage1_8/AI_Agent_Stage1_8_Interview_Guide.docx
@@ -824,7 +824,2807 @@
         <w:pStyle w:val="Heading1"/>
       </w:pPr>
       <w:r>
-        <w:t>二、核心概念速记</w:t>
+        <w:t>二、Stage 1-8 深度详解</w:t>
+      </w:r>
+    </w:p>
+    <w:p>
+      <w:pPr>
+        <w:pStyle w:val="Heading2"/>
+      </w:pPr>
+      <w:r>
+        <w:t>Stage 1: Minimal Agent Loop</w:t>
+      </w:r>
+    </w:p>
+    <w:tbl>
+      <w:tblPr>
+        <w:tblStyle w:val="TableGrid"/>
+        <w:tblW w:type="auto" w:w="0"/>
+        <w:jc w:val="center"/>
+        <w:tblLayout w:type="fixed"/>
+        <w:tblLook w:firstColumn="1" w:firstRow="1" w:lastColumn="0" w:lastRow="0" w:noHBand="0" w:noVBand="1" w:val="04A0"/>
+      </w:tblPr>
+      <w:tblGrid>
+        <w:gridCol w:w="4896"/>
+        <w:gridCol w:w="4896"/>
+      </w:tblGrid>
+      <w:tr>
+        <w:tc>
+          <w:tcPr>
+            <w:tcW w:type="dxa" w:w="1656"/>
+            <w:vAlign w:val="center"/>
+            <w:tcMar>
+              <w:top w:w="80" w:type="dxa"/>
+              <w:start w:w="120" w:type="dxa"/>
+              <w:bottom w:w="80" w:type="dxa"/>
+              <w:end w:w="120" w:type="dxa"/>
+            </w:tcMar>
+            <w:shd w:fill="E8EEF5"/>
+          </w:tcPr>
+          <w:p>
+            <w:pPr>
+              <w:jc w:val="left"/>
+            </w:pPr>
+            <w:r/>
+            <w:r>
+              <w:rPr>
+                <w:rFonts w:ascii="Calibri" w:hAnsi="Calibri"/>
+                <w:b/>
+                <w:color w:val="1F4D78"/>
+                <w:sz w:val="19"/>
+              </w:rPr>
+              <w:t>维度</w:t>
+            </w:r>
+          </w:p>
+        </w:tc>
+        <w:tc>
+          <w:tcPr>
+            <w:tcW w:type="dxa" w:w="7416"/>
+            <w:vAlign w:val="center"/>
+            <w:tcMar>
+              <w:top w:w="80" w:type="dxa"/>
+              <w:start w:w="120" w:type="dxa"/>
+              <w:bottom w:w="80" w:type="dxa"/>
+              <w:end w:w="120" w:type="dxa"/>
+            </w:tcMar>
+            <w:shd w:fill="E8EEF5"/>
+          </w:tcPr>
+          <w:p>
+            <w:pPr>
+              <w:jc w:val="left"/>
+            </w:pPr>
+            <w:r/>
+            <w:r>
+              <w:rPr>
+                <w:rFonts w:ascii="Calibri" w:hAnsi="Calibri"/>
+                <w:b/>
+                <w:color w:val="1F4D78"/>
+                <w:sz w:val="19"/>
+              </w:rPr>
+              <w:t>面试表达</w:t>
+            </w:r>
+          </w:p>
+        </w:tc>
+      </w:tr>
+      <w:tr>
+        <w:tc>
+          <w:tcPr>
+            <w:tcW w:type="dxa" w:w="4896"/>
+            <w:vAlign w:val="center"/>
+            <w:tcMar>
+              <w:top w:w="80" w:type="dxa"/>
+              <w:start w:w="120" w:type="dxa"/>
+              <w:bottom w:w="80" w:type="dxa"/>
+              <w:end w:w="120" w:type="dxa"/>
+            </w:tcMar>
+          </w:tcPr>
+          <w:p>
+            <w:pPr>
+              <w:jc w:val="left"/>
+            </w:pPr>
+            <w:r/>
+            <w:r>
+              <w:rPr>
+                <w:rFonts w:ascii="Calibri" w:hAnsi="Calibri"/>
+                <w:b/>
+                <w:sz w:val="19"/>
+              </w:rPr>
+              <w:t>学习目标</w:t>
+            </w:r>
+          </w:p>
+        </w:tc>
+        <w:tc>
+          <w:tcPr>
+            <w:tcW w:type="dxa" w:w="4896"/>
+            <w:vAlign w:val="center"/>
+            <w:tcMar>
+              <w:top w:w="80" w:type="dxa"/>
+              <w:start w:w="120" w:type="dxa"/>
+              <w:bottom w:w="80" w:type="dxa"/>
+              <w:end w:w="120" w:type="dxa"/>
+            </w:tcMar>
+          </w:tcPr>
+          <w:p>
+            <w:pPr>
+              <w:jc w:val="left"/>
+            </w:pPr>
+            <w:r/>
+            <w:r>
+              <w:rPr>
+                <w:rFonts w:ascii="Calibri" w:hAnsi="Calibri"/>
+                <w:b w:val="0"/>
+                <w:sz w:val="19"/>
+              </w:rPr>
+              <w:t>掌握一个 agent 如何在状态中观察、选择工具、执行工具、读取 observation，并在满足条件时输出 final answer。</w:t>
+            </w:r>
+          </w:p>
+        </w:tc>
+      </w:tr>
+      <w:tr>
+        <w:tc>
+          <w:tcPr>
+            <w:tcW w:type="dxa" w:w="4896"/>
+            <w:vAlign w:val="center"/>
+            <w:tcMar>
+              <w:top w:w="80" w:type="dxa"/>
+              <w:start w:w="120" w:type="dxa"/>
+              <w:bottom w:w="80" w:type="dxa"/>
+              <w:end w:w="120" w:type="dxa"/>
+            </w:tcMar>
+          </w:tcPr>
+          <w:p>
+            <w:pPr>
+              <w:jc w:val="left"/>
+            </w:pPr>
+            <w:r/>
+            <w:r>
+              <w:rPr>
+                <w:rFonts w:ascii="Calibri" w:hAnsi="Calibri"/>
+                <w:b/>
+                <w:sz w:val="19"/>
+              </w:rPr>
+              <w:t>核心概念</w:t>
+            </w:r>
+          </w:p>
+        </w:tc>
+        <w:tc>
+          <w:tcPr>
+            <w:tcW w:type="dxa" w:w="4896"/>
+            <w:vAlign w:val="center"/>
+            <w:tcMar>
+              <w:top w:w="80" w:type="dxa"/>
+              <w:start w:w="120" w:type="dxa"/>
+              <w:bottom w:w="80" w:type="dxa"/>
+              <w:end w:w="120" w:type="dxa"/>
+            </w:tcMar>
+          </w:tcPr>
+          <w:p>
+            <w:pPr>
+              <w:jc w:val="left"/>
+            </w:pPr>
+            <w:r/>
+            <w:r>
+              <w:rPr>
+                <w:rFonts w:ascii="Calibri" w:hAnsi="Calibri"/>
+                <w:b w:val="0"/>
+                <w:sz w:val="19"/>
+              </w:rPr>
+              <w:t>ToolCall、ToolResult、AgentStep、ToolRegistry、tool schema、trace、max_steps、错误停止。</w:t>
+            </w:r>
+          </w:p>
+        </w:tc>
+      </w:tr>
+      <w:tr>
+        <w:tc>
+          <w:tcPr>
+            <w:tcW w:type="dxa" w:w="4896"/>
+            <w:vAlign w:val="center"/>
+            <w:tcMar>
+              <w:top w:w="80" w:type="dxa"/>
+              <w:start w:w="120" w:type="dxa"/>
+              <w:bottom w:w="80" w:type="dxa"/>
+              <w:end w:w="120" w:type="dxa"/>
+            </w:tcMar>
+          </w:tcPr>
+          <w:p>
+            <w:pPr>
+              <w:jc w:val="left"/>
+            </w:pPr>
+            <w:r/>
+            <w:r>
+              <w:rPr>
+                <w:rFonts w:ascii="Calibri" w:hAnsi="Calibri"/>
+                <w:b/>
+                <w:sz w:val="19"/>
+              </w:rPr>
+              <w:t>工程实现</w:t>
+            </w:r>
+          </w:p>
+        </w:tc>
+        <w:tc>
+          <w:tcPr>
+            <w:tcW w:type="dxa" w:w="4896"/>
+            <w:vAlign w:val="center"/>
+            <w:tcMar>
+              <w:top w:w="80" w:type="dxa"/>
+              <w:start w:w="120" w:type="dxa"/>
+              <w:bottom w:w="80" w:type="dxa"/>
+              <w:end w:w="120" w:type="dxa"/>
+            </w:tcMar>
+          </w:tcPr>
+          <w:p>
+            <w:pPr>
+              <w:jc w:val="left"/>
+            </w:pPr>
+            <w:r/>
+            <w:r>
+              <w:rPr>
+                <w:rFonts w:ascii="Calibri" w:hAnsi="Calibri"/>
+                <w:b w:val="0"/>
+                <w:sz w:val="19"/>
+              </w:rPr>
+              <w:t>最小代码通常包含 model/policy、工具注册表、工具函数、循环控制器和 trace 输出。面试要强调：结构化 ToolCall 比自然语言动作更稳定。</w:t>
+            </w:r>
+          </w:p>
+        </w:tc>
+      </w:tr>
+      <w:tr>
+        <w:tc>
+          <w:tcPr>
+            <w:tcW w:type="dxa" w:w="4896"/>
+            <w:vAlign w:val="center"/>
+            <w:tcMar>
+              <w:top w:w="80" w:type="dxa"/>
+              <w:start w:w="120" w:type="dxa"/>
+              <w:bottom w:w="80" w:type="dxa"/>
+              <w:end w:w="120" w:type="dxa"/>
+            </w:tcMar>
+          </w:tcPr>
+          <w:p>
+            <w:pPr>
+              <w:jc w:val="left"/>
+            </w:pPr>
+            <w:r/>
+            <w:r>
+              <w:rPr>
+                <w:rFonts w:ascii="Calibri" w:hAnsi="Calibri"/>
+                <w:b/>
+                <w:sz w:val="19"/>
+              </w:rPr>
+              <w:t>项目映射</w:t>
+            </w:r>
+          </w:p>
+        </w:tc>
+        <w:tc>
+          <w:tcPr>
+            <w:tcW w:type="dxa" w:w="4896"/>
+            <w:vAlign w:val="center"/>
+            <w:tcMar>
+              <w:top w:w="80" w:type="dxa"/>
+              <w:start w:w="120" w:type="dxa"/>
+              <w:bottom w:w="80" w:type="dxa"/>
+              <w:end w:w="120" w:type="dxa"/>
+            </w:tcMar>
+          </w:tcPr>
+          <w:p>
+            <w:pPr>
+              <w:jc w:val="left"/>
+            </w:pPr>
+            <w:r/>
+            <w:r>
+              <w:rPr>
+                <w:rFonts w:ascii="Calibri" w:hAnsi="Calibri"/>
+                <w:b w:val="0"/>
+                <w:sz w:val="19"/>
+              </w:rPr>
+              <w:t>你的“任务规划-工具执行-证据校验-反思补查-报告生成”就是一个业务版 agent loop；异常输入是 observe，归因计划是 think，工具调用是 act，工具结果和证据是 observation。</w:t>
+            </w:r>
+          </w:p>
+        </w:tc>
+      </w:tr>
+      <w:tr>
+        <w:tc>
+          <w:tcPr>
+            <w:tcW w:type="dxa" w:w="4896"/>
+            <w:vAlign w:val="center"/>
+            <w:tcMar>
+              <w:top w:w="80" w:type="dxa"/>
+              <w:start w:w="120" w:type="dxa"/>
+              <w:bottom w:w="80" w:type="dxa"/>
+              <w:end w:w="120" w:type="dxa"/>
+            </w:tcMar>
+          </w:tcPr>
+          <w:p>
+            <w:pPr>
+              <w:jc w:val="left"/>
+            </w:pPr>
+            <w:r/>
+            <w:r>
+              <w:rPr>
+                <w:rFonts w:ascii="Calibri" w:hAnsi="Calibri"/>
+                <w:b/>
+                <w:sz w:val="19"/>
+              </w:rPr>
+              <w:t>常见追问</w:t>
+            </w:r>
+          </w:p>
+        </w:tc>
+        <w:tc>
+          <w:tcPr>
+            <w:tcW w:type="dxa" w:w="4896"/>
+            <w:vAlign w:val="center"/>
+            <w:tcMar>
+              <w:top w:w="80" w:type="dxa"/>
+              <w:start w:w="120" w:type="dxa"/>
+              <w:bottom w:w="80" w:type="dxa"/>
+              <w:end w:w="120" w:type="dxa"/>
+            </w:tcMar>
+          </w:tcPr>
+          <w:p>
+            <w:pPr>
+              <w:jc w:val="left"/>
+            </w:pPr>
+            <w:r/>
+            <w:r>
+              <w:rPr>
+                <w:rFonts w:ascii="Calibri" w:hAnsi="Calibri"/>
+                <w:b w:val="0"/>
+                <w:sz w:val="19"/>
+              </w:rPr>
+              <w:t>为什么需要 max_steps？工具参数错误怎么办？trace 能定位哪些问题？为什么不能让模型直接执行危险动作？</w:t>
+            </w:r>
+          </w:p>
+        </w:tc>
+      </w:tr>
+    </w:tbl>
+    <w:p>
+      <w:pPr>
+        <w:pStyle w:val="Heading2"/>
+      </w:pPr>
+      <w:r>
+        <w:t>Stage 2: Tool Use, RAG, Memory</w:t>
+      </w:r>
+    </w:p>
+    <w:tbl>
+      <w:tblPr>
+        <w:tblStyle w:val="TableGrid"/>
+        <w:tblW w:type="auto" w:w="0"/>
+        <w:jc w:val="center"/>
+        <w:tblLayout w:type="fixed"/>
+        <w:tblLook w:firstColumn="1" w:firstRow="1" w:lastColumn="0" w:lastRow="0" w:noHBand="0" w:noVBand="1" w:val="04A0"/>
+      </w:tblPr>
+      <w:tblGrid>
+        <w:gridCol w:w="4896"/>
+        <w:gridCol w:w="4896"/>
+      </w:tblGrid>
+      <w:tr>
+        <w:tc>
+          <w:tcPr>
+            <w:tcW w:type="dxa" w:w="1656"/>
+            <w:vAlign w:val="center"/>
+            <w:tcMar>
+              <w:top w:w="80" w:type="dxa"/>
+              <w:start w:w="120" w:type="dxa"/>
+              <w:bottom w:w="80" w:type="dxa"/>
+              <w:end w:w="120" w:type="dxa"/>
+            </w:tcMar>
+            <w:shd w:fill="E8EEF5"/>
+          </w:tcPr>
+          <w:p>
+            <w:pPr>
+              <w:jc w:val="left"/>
+            </w:pPr>
+            <w:r/>
+            <w:r>
+              <w:rPr>
+                <w:rFonts w:ascii="Calibri" w:hAnsi="Calibri"/>
+                <w:b/>
+                <w:color w:val="1F4D78"/>
+                <w:sz w:val="19"/>
+              </w:rPr>
+              <w:t>维度</w:t>
+            </w:r>
+          </w:p>
+        </w:tc>
+        <w:tc>
+          <w:tcPr>
+            <w:tcW w:type="dxa" w:w="7416"/>
+            <w:vAlign w:val="center"/>
+            <w:tcMar>
+              <w:top w:w="80" w:type="dxa"/>
+              <w:start w:w="120" w:type="dxa"/>
+              <w:bottom w:w="80" w:type="dxa"/>
+              <w:end w:w="120" w:type="dxa"/>
+            </w:tcMar>
+            <w:shd w:fill="E8EEF5"/>
+          </w:tcPr>
+          <w:p>
+            <w:pPr>
+              <w:jc w:val="left"/>
+            </w:pPr>
+            <w:r/>
+            <w:r>
+              <w:rPr>
+                <w:rFonts w:ascii="Calibri" w:hAnsi="Calibri"/>
+                <w:b/>
+                <w:color w:val="1F4D78"/>
+                <w:sz w:val="19"/>
+              </w:rPr>
+              <w:t>面试表达</w:t>
+            </w:r>
+          </w:p>
+        </w:tc>
+      </w:tr>
+      <w:tr>
+        <w:tc>
+          <w:tcPr>
+            <w:tcW w:type="dxa" w:w="4896"/>
+            <w:vAlign w:val="center"/>
+            <w:tcMar>
+              <w:top w:w="80" w:type="dxa"/>
+              <w:start w:w="120" w:type="dxa"/>
+              <w:bottom w:w="80" w:type="dxa"/>
+              <w:end w:w="120" w:type="dxa"/>
+            </w:tcMar>
+          </w:tcPr>
+          <w:p>
+            <w:pPr>
+              <w:jc w:val="left"/>
+            </w:pPr>
+            <w:r/>
+            <w:r>
+              <w:rPr>
+                <w:rFonts w:ascii="Calibri" w:hAnsi="Calibri"/>
+                <w:b/>
+                <w:sz w:val="19"/>
+              </w:rPr>
+              <w:t>学习目标</w:t>
+            </w:r>
+          </w:p>
+        </w:tc>
+        <w:tc>
+          <w:tcPr>
+            <w:tcW w:type="dxa" w:w="4896"/>
+            <w:vAlign w:val="center"/>
+            <w:tcMar>
+              <w:top w:w="80" w:type="dxa"/>
+              <w:start w:w="120" w:type="dxa"/>
+              <w:bottom w:w="80" w:type="dxa"/>
+              <w:end w:w="120" w:type="dxa"/>
+            </w:tcMar>
+          </w:tcPr>
+          <w:p>
+            <w:pPr>
+              <w:jc w:val="left"/>
+            </w:pPr>
+            <w:r/>
+            <w:r>
+              <w:rPr>
+                <w:rFonts w:ascii="Calibri" w:hAnsi="Calibri"/>
+                <w:b w:val="0"/>
+                <w:sz w:val="19"/>
+              </w:rPr>
+              <w:t>掌握资料型 agent 如何先检索证据，再生成 grounded answer，并把可复用信息写入 memory。</w:t>
+            </w:r>
+          </w:p>
+        </w:tc>
+      </w:tr>
+      <w:tr>
+        <w:tc>
+          <w:tcPr>
+            <w:tcW w:type="dxa" w:w="4896"/>
+            <w:vAlign w:val="center"/>
+            <w:tcMar>
+              <w:top w:w="80" w:type="dxa"/>
+              <w:start w:w="120" w:type="dxa"/>
+              <w:bottom w:w="80" w:type="dxa"/>
+              <w:end w:w="120" w:type="dxa"/>
+            </w:tcMar>
+          </w:tcPr>
+          <w:p>
+            <w:pPr>
+              <w:jc w:val="left"/>
+            </w:pPr>
+            <w:r/>
+            <w:r>
+              <w:rPr>
+                <w:rFonts w:ascii="Calibri" w:hAnsi="Calibri"/>
+                <w:b/>
+                <w:sz w:val="19"/>
+              </w:rPr>
+              <w:t>核心概念</w:t>
+            </w:r>
+          </w:p>
+        </w:tc>
+        <w:tc>
+          <w:tcPr>
+            <w:tcW w:type="dxa" w:w="4896"/>
+            <w:vAlign w:val="center"/>
+            <w:tcMar>
+              <w:top w:w="80" w:type="dxa"/>
+              <w:start w:w="120" w:type="dxa"/>
+              <w:bottom w:w="80" w:type="dxa"/>
+              <w:end w:w="120" w:type="dxa"/>
+            </w:tcMar>
+          </w:tcPr>
+          <w:p>
+            <w:pPr>
+              <w:jc w:val="left"/>
+            </w:pPr>
+            <w:r/>
+            <w:r>
+              <w:rPr>
+                <w:rFonts w:ascii="Calibri" w:hAnsi="Calibri"/>
+                <w:b w:val="0"/>
+                <w:sz w:val="19"/>
+              </w:rPr>
+              <w:t>chunk、tokenize、retrieval、top_k、citation、grounded answer、short-term memory、long-term memory、trace vs memory。</w:t>
+            </w:r>
+          </w:p>
+        </w:tc>
+      </w:tr>
+      <w:tr>
+        <w:tc>
+          <w:tcPr>
+            <w:tcW w:type="dxa" w:w="4896"/>
+            <w:vAlign w:val="center"/>
+            <w:tcMar>
+              <w:top w:w="80" w:type="dxa"/>
+              <w:start w:w="120" w:type="dxa"/>
+              <w:bottom w:w="80" w:type="dxa"/>
+              <w:end w:w="120" w:type="dxa"/>
+            </w:tcMar>
+          </w:tcPr>
+          <w:p>
+            <w:pPr>
+              <w:jc w:val="left"/>
+            </w:pPr>
+            <w:r/>
+            <w:r>
+              <w:rPr>
+                <w:rFonts w:ascii="Calibri" w:hAnsi="Calibri"/>
+                <w:b/>
+                <w:sz w:val="19"/>
+              </w:rPr>
+              <w:t>工程实现</w:t>
+            </w:r>
+          </w:p>
+        </w:tc>
+        <w:tc>
+          <w:tcPr>
+            <w:tcW w:type="dxa" w:w="4896"/>
+            <w:vAlign w:val="center"/>
+            <w:tcMar>
+              <w:top w:w="80" w:type="dxa"/>
+              <w:start w:w="120" w:type="dxa"/>
+              <w:bottom w:w="80" w:type="dxa"/>
+              <w:end w:w="120" w:type="dxa"/>
+            </w:tcMar>
+          </w:tcPr>
+          <w:p>
+            <w:pPr>
+              <w:jc w:val="left"/>
+            </w:pPr>
+            <w:r/>
+            <w:r>
+              <w:rPr>
+                <w:rFonts w:ascii="Calibri" w:hAnsi="Calibri"/>
+                <w:b w:val="0"/>
+                <w:sz w:val="19"/>
+              </w:rPr>
+              <w:t>RAG 链路要能说清：文档加载 -&gt; chunk -&gt; 向量/词频检索 -&gt; 排序 -&gt; 证据拼接 -&gt; 引用输出。没有证据时要拒答或降低置信度。</w:t>
+            </w:r>
+          </w:p>
+        </w:tc>
+      </w:tr>
+      <w:tr>
+        <w:tc>
+          <w:tcPr>
+            <w:tcW w:type="dxa" w:w="4896"/>
+            <w:vAlign w:val="center"/>
+            <w:tcMar>
+              <w:top w:w="80" w:type="dxa"/>
+              <w:start w:w="120" w:type="dxa"/>
+              <w:bottom w:w="80" w:type="dxa"/>
+              <w:end w:w="120" w:type="dxa"/>
+            </w:tcMar>
+          </w:tcPr>
+          <w:p>
+            <w:pPr>
+              <w:jc w:val="left"/>
+            </w:pPr>
+            <w:r/>
+            <w:r>
+              <w:rPr>
+                <w:rFonts w:ascii="Calibri" w:hAnsi="Calibri"/>
+                <w:b/>
+                <w:sz w:val="19"/>
+              </w:rPr>
+              <w:t>项目映射</w:t>
+            </w:r>
+          </w:p>
+        </w:tc>
+        <w:tc>
+          <w:tcPr>
+            <w:tcW w:type="dxa" w:w="4896"/>
+            <w:vAlign w:val="center"/>
+            <w:tcMar>
+              <w:top w:w="80" w:type="dxa"/>
+              <w:start w:w="120" w:type="dxa"/>
+              <w:bottom w:w="80" w:type="dxa"/>
+              <w:end w:w="120" w:type="dxa"/>
+            </w:tcMar>
+          </w:tcPr>
+          <w:p>
+            <w:pPr>
+              <w:jc w:val="left"/>
+            </w:pPr>
+            <w:r/>
+            <w:r>
+              <w:rPr>
+                <w:rFonts w:ascii="Calibri" w:hAnsi="Calibri"/>
+                <w:b w:val="0"/>
+                <w:sz w:val="19"/>
+              </w:rPr>
+              <w:t>你的证据链和归因记忆属于 Stage 2 能力：工具结果和归因结论需要结构化沉淀，后续 bad case 和类似异常可复用这些记忆。</w:t>
+            </w:r>
+          </w:p>
+        </w:tc>
+      </w:tr>
+      <w:tr>
+        <w:tc>
+          <w:tcPr>
+            <w:tcW w:type="dxa" w:w="4896"/>
+            <w:vAlign w:val="center"/>
+            <w:tcMar>
+              <w:top w:w="80" w:type="dxa"/>
+              <w:start w:w="120" w:type="dxa"/>
+              <w:bottom w:w="80" w:type="dxa"/>
+              <w:end w:w="120" w:type="dxa"/>
+            </w:tcMar>
+          </w:tcPr>
+          <w:p>
+            <w:pPr>
+              <w:jc w:val="left"/>
+            </w:pPr>
+            <w:r/>
+            <w:r>
+              <w:rPr>
+                <w:rFonts w:ascii="Calibri" w:hAnsi="Calibri"/>
+                <w:b/>
+                <w:sz w:val="19"/>
+              </w:rPr>
+              <w:t>常见追问</w:t>
+            </w:r>
+          </w:p>
+        </w:tc>
+        <w:tc>
+          <w:tcPr>
+            <w:tcW w:type="dxa" w:w="4896"/>
+            <w:vAlign w:val="center"/>
+            <w:tcMar>
+              <w:top w:w="80" w:type="dxa"/>
+              <w:start w:w="120" w:type="dxa"/>
+              <w:bottom w:w="80" w:type="dxa"/>
+              <w:end w:w="120" w:type="dxa"/>
+            </w:tcMar>
+          </w:tcPr>
+          <w:p>
+            <w:pPr>
+              <w:jc w:val="left"/>
+            </w:pPr>
+            <w:r/>
+            <w:r>
+              <w:rPr>
+                <w:rFonts w:ascii="Calibri" w:hAnsi="Calibri"/>
+                <w:b w:val="0"/>
+                <w:sz w:val="19"/>
+              </w:rPr>
+              <w:t>召回不准怎么办？chunk 太大/太小的影响？memory 里不该存什么？如何避免模型基于无证据内容生成结论？</w:t>
+            </w:r>
+          </w:p>
+        </w:tc>
+      </w:tr>
+    </w:tbl>
+    <w:p>
+      <w:pPr>
+        <w:pStyle w:val="Heading2"/>
+      </w:pPr>
+      <w:r>
+        <w:t>Stage 3: Agent Harness</w:t>
+      </w:r>
+    </w:p>
+    <w:tbl>
+      <w:tblPr>
+        <w:tblStyle w:val="TableGrid"/>
+        <w:tblW w:type="auto" w:w="0"/>
+        <w:jc w:val="center"/>
+        <w:tblLayout w:type="fixed"/>
+        <w:tblLook w:firstColumn="1" w:firstRow="1" w:lastColumn="0" w:lastRow="0" w:noHBand="0" w:noVBand="1" w:val="04A0"/>
+      </w:tblPr>
+      <w:tblGrid>
+        <w:gridCol w:w="4896"/>
+        <w:gridCol w:w="4896"/>
+      </w:tblGrid>
+      <w:tr>
+        <w:tc>
+          <w:tcPr>
+            <w:tcW w:type="dxa" w:w="1656"/>
+            <w:vAlign w:val="center"/>
+            <w:tcMar>
+              <w:top w:w="80" w:type="dxa"/>
+              <w:start w:w="120" w:type="dxa"/>
+              <w:bottom w:w="80" w:type="dxa"/>
+              <w:end w:w="120" w:type="dxa"/>
+            </w:tcMar>
+            <w:shd w:fill="E8EEF5"/>
+          </w:tcPr>
+          <w:p>
+            <w:pPr>
+              <w:jc w:val="left"/>
+            </w:pPr>
+            <w:r/>
+            <w:r>
+              <w:rPr>
+                <w:rFonts w:ascii="Calibri" w:hAnsi="Calibri"/>
+                <w:b/>
+                <w:color w:val="1F4D78"/>
+                <w:sz w:val="19"/>
+              </w:rPr>
+              <w:t>维度</w:t>
+            </w:r>
+          </w:p>
+        </w:tc>
+        <w:tc>
+          <w:tcPr>
+            <w:tcW w:type="dxa" w:w="7416"/>
+            <w:vAlign w:val="center"/>
+            <w:tcMar>
+              <w:top w:w="80" w:type="dxa"/>
+              <w:start w:w="120" w:type="dxa"/>
+              <w:bottom w:w="80" w:type="dxa"/>
+              <w:end w:w="120" w:type="dxa"/>
+            </w:tcMar>
+            <w:shd w:fill="E8EEF5"/>
+          </w:tcPr>
+          <w:p>
+            <w:pPr>
+              <w:jc w:val="left"/>
+            </w:pPr>
+            <w:r/>
+            <w:r>
+              <w:rPr>
+                <w:rFonts w:ascii="Calibri" w:hAnsi="Calibri"/>
+                <w:b/>
+                <w:color w:val="1F4D78"/>
+                <w:sz w:val="19"/>
+              </w:rPr>
+              <w:t>面试表达</w:t>
+            </w:r>
+          </w:p>
+        </w:tc>
+      </w:tr>
+      <w:tr>
+        <w:tc>
+          <w:tcPr>
+            <w:tcW w:type="dxa" w:w="4896"/>
+            <w:vAlign w:val="center"/>
+            <w:tcMar>
+              <w:top w:w="80" w:type="dxa"/>
+              <w:start w:w="120" w:type="dxa"/>
+              <w:bottom w:w="80" w:type="dxa"/>
+              <w:end w:w="120" w:type="dxa"/>
+            </w:tcMar>
+          </w:tcPr>
+          <w:p>
+            <w:pPr>
+              <w:jc w:val="left"/>
+            </w:pPr>
+            <w:r/>
+            <w:r>
+              <w:rPr>
+                <w:rFonts w:ascii="Calibri" w:hAnsi="Calibri"/>
+                <w:b/>
+                <w:sz w:val="19"/>
+              </w:rPr>
+              <w:t>学习目标</w:t>
+            </w:r>
+          </w:p>
+        </w:tc>
+        <w:tc>
+          <w:tcPr>
+            <w:tcW w:type="dxa" w:w="4896"/>
+            <w:vAlign w:val="center"/>
+            <w:tcMar>
+              <w:top w:w="80" w:type="dxa"/>
+              <w:start w:w="120" w:type="dxa"/>
+              <w:bottom w:w="80" w:type="dxa"/>
+              <w:end w:w="120" w:type="dxa"/>
+            </w:tcMar>
+          </w:tcPr>
+          <w:p>
+            <w:pPr>
+              <w:jc w:val="left"/>
+            </w:pPr>
+            <w:r/>
+            <w:r>
+              <w:rPr>
+                <w:rFonts w:ascii="Calibri" w:hAnsi="Calibri"/>
+                <w:b w:val="0"/>
+                <w:sz w:val="19"/>
+              </w:rPr>
+              <w:t>理解模型外面的工程运行层：工具、权限、状态、session、trace、预算、错误恢复都由 harness 管。</w:t>
+            </w:r>
+          </w:p>
+        </w:tc>
+      </w:tr>
+      <w:tr>
+        <w:tc>
+          <w:tcPr>
+            <w:tcW w:type="dxa" w:w="4896"/>
+            <w:vAlign w:val="center"/>
+            <w:tcMar>
+              <w:top w:w="80" w:type="dxa"/>
+              <w:start w:w="120" w:type="dxa"/>
+              <w:bottom w:w="80" w:type="dxa"/>
+              <w:end w:w="120" w:type="dxa"/>
+            </w:tcMar>
+          </w:tcPr>
+          <w:p>
+            <w:pPr>
+              <w:jc w:val="left"/>
+            </w:pPr>
+            <w:r/>
+            <w:r>
+              <w:rPr>
+                <w:rFonts w:ascii="Calibri" w:hAnsi="Calibri"/>
+                <w:b/>
+                <w:sz w:val="19"/>
+              </w:rPr>
+              <w:t>核心概念</w:t>
+            </w:r>
+          </w:p>
+        </w:tc>
+        <w:tc>
+          <w:tcPr>
+            <w:tcW w:type="dxa" w:w="4896"/>
+            <w:vAlign w:val="center"/>
+            <w:tcMar>
+              <w:top w:w="80" w:type="dxa"/>
+              <w:start w:w="120" w:type="dxa"/>
+              <w:bottom w:w="80" w:type="dxa"/>
+              <w:end w:w="120" w:type="dxa"/>
+            </w:tcMar>
+          </w:tcPr>
+          <w:p>
+            <w:pPr>
+              <w:jc w:val="left"/>
+            </w:pPr>
+            <w:r/>
+            <w:r>
+              <w:rPr>
+                <w:rFonts w:ascii="Calibri" w:hAnsi="Calibri"/>
+                <w:b w:val="0"/>
+                <w:sz w:val="19"/>
+              </w:rPr>
+              <w:t>ToolRegistry、PermissionGate、SessionStore、TraceEvent、budget、sandbox、retry、approval。</w:t>
+            </w:r>
+          </w:p>
+        </w:tc>
+      </w:tr>
+      <w:tr>
+        <w:tc>
+          <w:tcPr>
+            <w:tcW w:type="dxa" w:w="4896"/>
+            <w:vAlign w:val="center"/>
+            <w:tcMar>
+              <w:top w:w="80" w:type="dxa"/>
+              <w:start w:w="120" w:type="dxa"/>
+              <w:bottom w:w="80" w:type="dxa"/>
+              <w:end w:w="120" w:type="dxa"/>
+            </w:tcMar>
+          </w:tcPr>
+          <w:p>
+            <w:pPr>
+              <w:jc w:val="left"/>
+            </w:pPr>
+            <w:r/>
+            <w:r>
+              <w:rPr>
+                <w:rFonts w:ascii="Calibri" w:hAnsi="Calibri"/>
+                <w:b/>
+                <w:sz w:val="19"/>
+              </w:rPr>
+              <w:t>工程实现</w:t>
+            </w:r>
+          </w:p>
+        </w:tc>
+        <w:tc>
+          <w:tcPr>
+            <w:tcW w:type="dxa" w:w="4896"/>
+            <w:vAlign w:val="center"/>
+            <w:tcMar>
+              <w:top w:w="80" w:type="dxa"/>
+              <w:start w:w="120" w:type="dxa"/>
+              <w:bottom w:w="80" w:type="dxa"/>
+              <w:end w:w="120" w:type="dxa"/>
+            </w:tcMar>
+          </w:tcPr>
+          <w:p>
+            <w:pPr>
+              <w:jc w:val="left"/>
+            </w:pPr>
+            <w:r/>
+            <w:r>
+              <w:rPr>
+                <w:rFonts w:ascii="Calibri" w:hAnsi="Calibri"/>
+                <w:b w:val="0"/>
+                <w:sz w:val="19"/>
+              </w:rPr>
+              <w:t>Harness.run 的典型流程是：接收任务 -&gt; 规划 tool call -&gt; 查 registry -&gt; 权限检查 -&gt; 执行工具 -&gt; 写 trace -&gt; 更新状态 -&gt; 判断停止。</w:t>
+            </w:r>
+          </w:p>
+        </w:tc>
+      </w:tr>
+      <w:tr>
+        <w:tc>
+          <w:tcPr>
+            <w:tcW w:type="dxa" w:w="4896"/>
+            <w:vAlign w:val="center"/>
+            <w:tcMar>
+              <w:top w:w="80" w:type="dxa"/>
+              <w:start w:w="120" w:type="dxa"/>
+              <w:bottom w:w="80" w:type="dxa"/>
+              <w:end w:w="120" w:type="dxa"/>
+            </w:tcMar>
+          </w:tcPr>
+          <w:p>
+            <w:pPr>
+              <w:jc w:val="left"/>
+            </w:pPr>
+            <w:r/>
+            <w:r>
+              <w:rPr>
+                <w:rFonts w:ascii="Calibri" w:hAnsi="Calibri"/>
+                <w:b/>
+                <w:sz w:val="19"/>
+              </w:rPr>
+              <w:t>项目映射</w:t>
+            </w:r>
+          </w:p>
+        </w:tc>
+        <w:tc>
+          <w:tcPr>
+            <w:tcW w:type="dxa" w:w="4896"/>
+            <w:vAlign w:val="center"/>
+            <w:tcMar>
+              <w:top w:w="80" w:type="dxa"/>
+              <w:start w:w="120" w:type="dxa"/>
+              <w:bottom w:w="80" w:type="dxa"/>
+              <w:end w:w="120" w:type="dxa"/>
+            </w:tcMar>
+          </w:tcPr>
+          <w:p>
+            <w:pPr>
+              <w:jc w:val="left"/>
+            </w:pPr>
+            <w:r/>
+            <w:r>
+              <w:rPr>
+                <w:rFonts w:ascii="Calibri" w:hAnsi="Calibri"/>
+                <w:b w:val="0"/>
+                <w:sz w:val="19"/>
+              </w:rPr>
+              <w:t>WorkflowState + 工具执行 + 证据校验 + 反思日志就是你的项目 harness 思维。它让模型输出不再是黑盒，而是可审计的执行链路。</w:t>
+            </w:r>
+          </w:p>
+        </w:tc>
+      </w:tr>
+      <w:tr>
+        <w:tc>
+          <w:tcPr>
+            <w:tcW w:type="dxa" w:w="4896"/>
+            <w:vAlign w:val="center"/>
+            <w:tcMar>
+              <w:top w:w="80" w:type="dxa"/>
+              <w:start w:w="120" w:type="dxa"/>
+              <w:bottom w:w="80" w:type="dxa"/>
+              <w:end w:w="120" w:type="dxa"/>
+            </w:tcMar>
+          </w:tcPr>
+          <w:p>
+            <w:pPr>
+              <w:jc w:val="left"/>
+            </w:pPr>
+            <w:r/>
+            <w:r>
+              <w:rPr>
+                <w:rFonts w:ascii="Calibri" w:hAnsi="Calibri"/>
+                <w:b/>
+                <w:sz w:val="19"/>
+              </w:rPr>
+              <w:t>常见追问</w:t>
+            </w:r>
+          </w:p>
+        </w:tc>
+        <w:tc>
+          <w:tcPr>
+            <w:tcW w:type="dxa" w:w="4896"/>
+            <w:vAlign w:val="center"/>
+            <w:tcMar>
+              <w:top w:w="80" w:type="dxa"/>
+              <w:start w:w="120" w:type="dxa"/>
+              <w:bottom w:w="80" w:type="dxa"/>
+              <w:end w:w="120" w:type="dxa"/>
+            </w:tcMar>
+          </w:tcPr>
+          <w:p>
+            <w:pPr>
+              <w:jc w:val="left"/>
+            </w:pPr>
+            <w:r/>
+            <w:r>
+              <w:rPr>
+                <w:rFonts w:ascii="Calibri" w:hAnsi="Calibri"/>
+                <w:b w:val="0"/>
+                <w:sz w:val="19"/>
+              </w:rPr>
+              <w:t>哪些工具要人工确认？权限检查放在哪里？为什么状态不能只靠 prompt？如何用 session 复盘一次失败运行？</w:t>
+            </w:r>
+          </w:p>
+        </w:tc>
+      </w:tr>
+    </w:tbl>
+    <w:p>
+      <w:pPr>
+        <w:pStyle w:val="Heading2"/>
+      </w:pPr>
+      <w:r>
+        <w:t>Stage 4: Multi-Agent Coordination</w:t>
+      </w:r>
+    </w:p>
+    <w:tbl>
+      <w:tblPr>
+        <w:tblStyle w:val="TableGrid"/>
+        <w:tblW w:type="auto" w:w="0"/>
+        <w:jc w:val="center"/>
+        <w:tblLayout w:type="fixed"/>
+        <w:tblLook w:firstColumn="1" w:firstRow="1" w:lastColumn="0" w:lastRow="0" w:noHBand="0" w:noVBand="1" w:val="04A0"/>
+      </w:tblPr>
+      <w:tblGrid>
+        <w:gridCol w:w="4896"/>
+        <w:gridCol w:w="4896"/>
+      </w:tblGrid>
+      <w:tr>
+        <w:tc>
+          <w:tcPr>
+            <w:tcW w:type="dxa" w:w="1656"/>
+            <w:vAlign w:val="center"/>
+            <w:tcMar>
+              <w:top w:w="80" w:type="dxa"/>
+              <w:start w:w="120" w:type="dxa"/>
+              <w:bottom w:w="80" w:type="dxa"/>
+              <w:end w:w="120" w:type="dxa"/>
+            </w:tcMar>
+            <w:shd w:fill="E8EEF5"/>
+          </w:tcPr>
+          <w:p>
+            <w:pPr>
+              <w:jc w:val="left"/>
+            </w:pPr>
+            <w:r/>
+            <w:r>
+              <w:rPr>
+                <w:rFonts w:ascii="Calibri" w:hAnsi="Calibri"/>
+                <w:b/>
+                <w:color w:val="1F4D78"/>
+                <w:sz w:val="19"/>
+              </w:rPr>
+              <w:t>维度</w:t>
+            </w:r>
+          </w:p>
+        </w:tc>
+        <w:tc>
+          <w:tcPr>
+            <w:tcW w:type="dxa" w:w="7416"/>
+            <w:vAlign w:val="center"/>
+            <w:tcMar>
+              <w:top w:w="80" w:type="dxa"/>
+              <w:start w:w="120" w:type="dxa"/>
+              <w:bottom w:w="80" w:type="dxa"/>
+              <w:end w:w="120" w:type="dxa"/>
+            </w:tcMar>
+            <w:shd w:fill="E8EEF5"/>
+          </w:tcPr>
+          <w:p>
+            <w:pPr>
+              <w:jc w:val="left"/>
+            </w:pPr>
+            <w:r/>
+            <w:r>
+              <w:rPr>
+                <w:rFonts w:ascii="Calibri" w:hAnsi="Calibri"/>
+                <w:b/>
+                <w:color w:val="1F4D78"/>
+                <w:sz w:val="19"/>
+              </w:rPr>
+              <w:t>面试表达</w:t>
+            </w:r>
+          </w:p>
+        </w:tc>
+      </w:tr>
+      <w:tr>
+        <w:tc>
+          <w:tcPr>
+            <w:tcW w:type="dxa" w:w="4896"/>
+            <w:vAlign w:val="center"/>
+            <w:tcMar>
+              <w:top w:w="80" w:type="dxa"/>
+              <w:start w:w="120" w:type="dxa"/>
+              <w:bottom w:w="80" w:type="dxa"/>
+              <w:end w:w="120" w:type="dxa"/>
+            </w:tcMar>
+          </w:tcPr>
+          <w:p>
+            <w:pPr>
+              <w:jc w:val="left"/>
+            </w:pPr>
+            <w:r/>
+            <w:r>
+              <w:rPr>
+                <w:rFonts w:ascii="Calibri" w:hAnsi="Calibri"/>
+                <w:b/>
+                <w:sz w:val="19"/>
+              </w:rPr>
+              <w:t>学习目标</w:t>
+            </w:r>
+          </w:p>
+        </w:tc>
+        <w:tc>
+          <w:tcPr>
+            <w:tcW w:type="dxa" w:w="4896"/>
+            <w:vAlign w:val="center"/>
+            <w:tcMar>
+              <w:top w:w="80" w:type="dxa"/>
+              <w:start w:w="120" w:type="dxa"/>
+              <w:bottom w:w="80" w:type="dxa"/>
+              <w:end w:w="120" w:type="dxa"/>
+            </w:tcMar>
+          </w:tcPr>
+          <w:p>
+            <w:pPr>
+              <w:jc w:val="left"/>
+            </w:pPr>
+            <w:r/>
+            <w:r>
+              <w:rPr>
+                <w:rFonts w:ascii="Calibri" w:hAnsi="Calibri"/>
+                <w:b w:val="0"/>
+                <w:sz w:val="19"/>
+              </w:rPr>
+              <w:t>理解多 agent 的难点不是角色多，而是职责边界、输入输出 schema、supervisor 控制和停止条件。</w:t>
+            </w:r>
+          </w:p>
+        </w:tc>
+      </w:tr>
+      <w:tr>
+        <w:tc>
+          <w:tcPr>
+            <w:tcW w:type="dxa" w:w="4896"/>
+            <w:vAlign w:val="center"/>
+            <w:tcMar>
+              <w:top w:w="80" w:type="dxa"/>
+              <w:start w:w="120" w:type="dxa"/>
+              <w:bottom w:w="80" w:type="dxa"/>
+              <w:end w:w="120" w:type="dxa"/>
+            </w:tcMar>
+          </w:tcPr>
+          <w:p>
+            <w:pPr>
+              <w:jc w:val="left"/>
+            </w:pPr>
+            <w:r/>
+            <w:r>
+              <w:rPr>
+                <w:rFonts w:ascii="Calibri" w:hAnsi="Calibri"/>
+                <w:b/>
+                <w:sz w:val="19"/>
+              </w:rPr>
+              <w:t>核心概念</w:t>
+            </w:r>
+          </w:p>
+        </w:tc>
+        <w:tc>
+          <w:tcPr>
+            <w:tcW w:type="dxa" w:w="4896"/>
+            <w:vAlign w:val="center"/>
+            <w:tcMar>
+              <w:top w:w="80" w:type="dxa"/>
+              <w:start w:w="120" w:type="dxa"/>
+              <w:bottom w:w="80" w:type="dxa"/>
+              <w:end w:w="120" w:type="dxa"/>
+            </w:tcMar>
+          </w:tcPr>
+          <w:p>
+            <w:pPr>
+              <w:jc w:val="left"/>
+            </w:pPr>
+            <w:r/>
+            <w:r>
+              <w:rPr>
+                <w:rFonts w:ascii="Calibri" w:hAnsi="Calibri"/>
+                <w:b w:val="0"/>
+                <w:sz w:val="19"/>
+              </w:rPr>
+              <w:t>researcher/writer/reviewer/reviser、supervisor、graph、schema、循环控制、上下文隔离。</w:t>
+            </w:r>
+          </w:p>
+        </w:tc>
+      </w:tr>
+      <w:tr>
+        <w:tc>
+          <w:tcPr>
+            <w:tcW w:type="dxa" w:w="4896"/>
+            <w:vAlign w:val="center"/>
+            <w:tcMar>
+              <w:top w:w="80" w:type="dxa"/>
+              <w:start w:w="120" w:type="dxa"/>
+              <w:bottom w:w="80" w:type="dxa"/>
+              <w:end w:w="120" w:type="dxa"/>
+            </w:tcMar>
+          </w:tcPr>
+          <w:p>
+            <w:pPr>
+              <w:jc w:val="left"/>
+            </w:pPr>
+            <w:r/>
+            <w:r>
+              <w:rPr>
+                <w:rFonts w:ascii="Calibri" w:hAnsi="Calibri"/>
+                <w:b/>
+                <w:sz w:val="19"/>
+              </w:rPr>
+              <w:t>工程实现</w:t>
+            </w:r>
+          </w:p>
+        </w:tc>
+        <w:tc>
+          <w:tcPr>
+            <w:tcW w:type="dxa" w:w="4896"/>
+            <w:vAlign w:val="center"/>
+            <w:tcMar>
+              <w:top w:w="80" w:type="dxa"/>
+              <w:start w:w="120" w:type="dxa"/>
+              <w:bottom w:w="80" w:type="dxa"/>
+              <w:end w:w="120" w:type="dxa"/>
+            </w:tcMar>
+          </w:tcPr>
+          <w:p>
+            <w:pPr>
+              <w:jc w:val="left"/>
+            </w:pPr>
+            <w:r/>
+            <w:r>
+              <w:rPr>
+                <w:rFonts w:ascii="Calibri" w:hAnsi="Calibri"/>
+                <w:b w:val="0"/>
+                <w:sz w:val="19"/>
+              </w:rPr>
+              <w:t>多 agent 要避免无限争论和上下文膨胀。每个 agent 应只做一类任务，并输出可校验结构，由 supervisor 决定是否流转。</w:t>
+            </w:r>
+          </w:p>
+        </w:tc>
+      </w:tr>
+      <w:tr>
+        <w:tc>
+          <w:tcPr>
+            <w:tcW w:type="dxa" w:w="4896"/>
+            <w:vAlign w:val="center"/>
+            <w:tcMar>
+              <w:top w:w="80" w:type="dxa"/>
+              <w:start w:w="120" w:type="dxa"/>
+              <w:bottom w:w="80" w:type="dxa"/>
+              <w:end w:w="120" w:type="dxa"/>
+            </w:tcMar>
+          </w:tcPr>
+          <w:p>
+            <w:pPr>
+              <w:jc w:val="left"/>
+            </w:pPr>
+            <w:r/>
+            <w:r>
+              <w:rPr>
+                <w:rFonts w:ascii="Calibri" w:hAnsi="Calibri"/>
+                <w:b/>
+                <w:sz w:val="19"/>
+              </w:rPr>
+              <w:t>项目映射</w:t>
+            </w:r>
+          </w:p>
+        </w:tc>
+        <w:tc>
+          <w:tcPr>
+            <w:tcW w:type="dxa" w:w="4896"/>
+            <w:vAlign w:val="center"/>
+            <w:tcMar>
+              <w:top w:w="80" w:type="dxa"/>
+              <w:start w:w="120" w:type="dxa"/>
+              <w:bottom w:w="80" w:type="dxa"/>
+              <w:end w:w="120" w:type="dxa"/>
+            </w:tcMar>
+          </w:tcPr>
+          <w:p>
+            <w:pPr>
+              <w:jc w:val="left"/>
+            </w:pPr>
+            <w:r/>
+            <w:r>
+              <w:rPr>
+                <w:rFonts w:ascii="Calibri" w:hAnsi="Calibri"/>
+                <w:b w:val="0"/>
+                <w:sz w:val="19"/>
+              </w:rPr>
+              <w:t>你的链路可映射为 planner、tool executor、evidence checker、reflector、reporter 等模块协作；即使不是独立 agent，也体现了职责分离。</w:t>
+            </w:r>
+          </w:p>
+        </w:tc>
+      </w:tr>
+      <w:tr>
+        <w:tc>
+          <w:tcPr>
+            <w:tcW w:type="dxa" w:w="4896"/>
+            <w:vAlign w:val="center"/>
+            <w:tcMar>
+              <w:top w:w="80" w:type="dxa"/>
+              <w:start w:w="120" w:type="dxa"/>
+              <w:bottom w:w="80" w:type="dxa"/>
+              <w:end w:w="120" w:type="dxa"/>
+            </w:tcMar>
+          </w:tcPr>
+          <w:p>
+            <w:pPr>
+              <w:jc w:val="left"/>
+            </w:pPr>
+            <w:r/>
+            <w:r>
+              <w:rPr>
+                <w:rFonts w:ascii="Calibri" w:hAnsi="Calibri"/>
+                <w:b/>
+                <w:sz w:val="19"/>
+              </w:rPr>
+              <w:t>常见追问</w:t>
+            </w:r>
+          </w:p>
+        </w:tc>
+        <w:tc>
+          <w:tcPr>
+            <w:tcW w:type="dxa" w:w="4896"/>
+            <w:vAlign w:val="center"/>
+            <w:tcMar>
+              <w:top w:w="80" w:type="dxa"/>
+              <w:start w:w="120" w:type="dxa"/>
+              <w:bottom w:w="80" w:type="dxa"/>
+              <w:end w:w="120" w:type="dxa"/>
+            </w:tcMar>
+          </w:tcPr>
+          <w:p>
+            <w:pPr>
+              <w:jc w:val="left"/>
+            </w:pPr>
+            <w:r/>
+            <w:r>
+              <w:rPr>
+                <w:rFonts w:ascii="Calibri" w:hAnsi="Calibri"/>
+                <w:b w:val="0"/>
+                <w:sz w:val="19"/>
+              </w:rPr>
+              <w:t>什么时候需要 multi-agent？怎么避免循环？reviewer 输出应该是什么结构？多 agent 比单 agent 多了哪些工程风险？</w:t>
+            </w:r>
+          </w:p>
+        </w:tc>
+      </w:tr>
+    </w:tbl>
+    <w:p>
+      <w:pPr>
+        <w:pStyle w:val="Heading2"/>
+      </w:pPr>
+      <w:r>
+        <w:t>Stage 5: Skills, MCP, Protocols</w:t>
+      </w:r>
+    </w:p>
+    <w:tbl>
+      <w:tblPr>
+        <w:tblStyle w:val="TableGrid"/>
+        <w:tblW w:type="auto" w:w="0"/>
+        <w:jc w:val="center"/>
+        <w:tblLayout w:type="fixed"/>
+        <w:tblLook w:firstColumn="1" w:firstRow="1" w:lastColumn="0" w:lastRow="0" w:noHBand="0" w:noVBand="1" w:val="04A0"/>
+      </w:tblPr>
+      <w:tblGrid>
+        <w:gridCol w:w="4896"/>
+        <w:gridCol w:w="4896"/>
+      </w:tblGrid>
+      <w:tr>
+        <w:tc>
+          <w:tcPr>
+            <w:tcW w:type="dxa" w:w="1656"/>
+            <w:vAlign w:val="center"/>
+            <w:tcMar>
+              <w:top w:w="80" w:type="dxa"/>
+              <w:start w:w="120" w:type="dxa"/>
+              <w:bottom w:w="80" w:type="dxa"/>
+              <w:end w:w="120" w:type="dxa"/>
+            </w:tcMar>
+            <w:shd w:fill="E8EEF5"/>
+          </w:tcPr>
+          <w:p>
+            <w:pPr>
+              <w:jc w:val="left"/>
+            </w:pPr>
+            <w:r/>
+            <w:r>
+              <w:rPr>
+                <w:rFonts w:ascii="Calibri" w:hAnsi="Calibri"/>
+                <w:b/>
+                <w:color w:val="1F4D78"/>
+                <w:sz w:val="19"/>
+              </w:rPr>
+              <w:t>维度</w:t>
+            </w:r>
+          </w:p>
+        </w:tc>
+        <w:tc>
+          <w:tcPr>
+            <w:tcW w:type="dxa" w:w="7416"/>
+            <w:vAlign w:val="center"/>
+            <w:tcMar>
+              <w:top w:w="80" w:type="dxa"/>
+              <w:start w:w="120" w:type="dxa"/>
+              <w:bottom w:w="80" w:type="dxa"/>
+              <w:end w:w="120" w:type="dxa"/>
+            </w:tcMar>
+            <w:shd w:fill="E8EEF5"/>
+          </w:tcPr>
+          <w:p>
+            <w:pPr>
+              <w:jc w:val="left"/>
+            </w:pPr>
+            <w:r/>
+            <w:r>
+              <w:rPr>
+                <w:rFonts w:ascii="Calibri" w:hAnsi="Calibri"/>
+                <w:b/>
+                <w:color w:val="1F4D78"/>
+                <w:sz w:val="19"/>
+              </w:rPr>
+              <w:t>面试表达</w:t>
+            </w:r>
+          </w:p>
+        </w:tc>
+      </w:tr>
+      <w:tr>
+        <w:tc>
+          <w:tcPr>
+            <w:tcW w:type="dxa" w:w="4896"/>
+            <w:vAlign w:val="center"/>
+            <w:tcMar>
+              <w:top w:w="80" w:type="dxa"/>
+              <w:start w:w="120" w:type="dxa"/>
+              <w:bottom w:w="80" w:type="dxa"/>
+              <w:end w:w="120" w:type="dxa"/>
+            </w:tcMar>
+          </w:tcPr>
+          <w:p>
+            <w:pPr>
+              <w:jc w:val="left"/>
+            </w:pPr>
+            <w:r/>
+            <w:r>
+              <w:rPr>
+                <w:rFonts w:ascii="Calibri" w:hAnsi="Calibri"/>
+                <w:b/>
+                <w:sz w:val="19"/>
+              </w:rPr>
+              <w:t>学习目标</w:t>
+            </w:r>
+          </w:p>
+        </w:tc>
+        <w:tc>
+          <w:tcPr>
+            <w:tcW w:type="dxa" w:w="4896"/>
+            <w:vAlign w:val="center"/>
+            <w:tcMar>
+              <w:top w:w="80" w:type="dxa"/>
+              <w:start w:w="120" w:type="dxa"/>
+              <w:bottom w:w="80" w:type="dxa"/>
+              <w:end w:w="120" w:type="dxa"/>
+            </w:tcMar>
+          </w:tcPr>
+          <w:p>
+            <w:pPr>
+              <w:jc w:val="left"/>
+            </w:pPr>
+            <w:r/>
+            <w:r>
+              <w:rPr>
+                <w:rFonts w:ascii="Calibri" w:hAnsi="Calibri"/>
+                <w:b w:val="0"/>
+                <w:sz w:val="19"/>
+              </w:rPr>
+              <w:t>掌握能力打包：Tool 是函数，Skill 是一套可复用流程知识，MCP/A2A/ACP 是不同层面的连接协议。</w:t>
+            </w:r>
+          </w:p>
+        </w:tc>
+      </w:tr>
+      <w:tr>
+        <w:tc>
+          <w:tcPr>
+            <w:tcW w:type="dxa" w:w="4896"/>
+            <w:vAlign w:val="center"/>
+            <w:tcMar>
+              <w:top w:w="80" w:type="dxa"/>
+              <w:start w:w="120" w:type="dxa"/>
+              <w:bottom w:w="80" w:type="dxa"/>
+              <w:end w:w="120" w:type="dxa"/>
+            </w:tcMar>
+          </w:tcPr>
+          <w:p>
+            <w:pPr>
+              <w:jc w:val="left"/>
+            </w:pPr>
+            <w:r/>
+            <w:r>
+              <w:rPr>
+                <w:rFonts w:ascii="Calibri" w:hAnsi="Calibri"/>
+                <w:b/>
+                <w:sz w:val="19"/>
+              </w:rPr>
+              <w:t>核心概念</w:t>
+            </w:r>
+          </w:p>
+        </w:tc>
+        <w:tc>
+          <w:tcPr>
+            <w:tcW w:type="dxa" w:w="4896"/>
+            <w:vAlign w:val="center"/>
+            <w:tcMar>
+              <w:top w:w="80" w:type="dxa"/>
+              <w:start w:w="120" w:type="dxa"/>
+              <w:bottom w:w="80" w:type="dxa"/>
+              <w:end w:w="120" w:type="dxa"/>
+            </w:tcMar>
+          </w:tcPr>
+          <w:p>
+            <w:pPr>
+              <w:jc w:val="left"/>
+            </w:pPr>
+            <w:r/>
+            <w:r>
+              <w:rPr>
+                <w:rFonts w:ascii="Calibri" w:hAnsi="Calibri"/>
+                <w:b w:val="0"/>
+                <w:sz w:val="19"/>
+              </w:rPr>
+              <w:t>Tool、Skill、SKILL.md、template、smoke test、MCP server、A2A、ACP。</w:t>
+            </w:r>
+          </w:p>
+        </w:tc>
+      </w:tr>
+      <w:tr>
+        <w:tc>
+          <w:tcPr>
+            <w:tcW w:type="dxa" w:w="4896"/>
+            <w:vAlign w:val="center"/>
+            <w:tcMar>
+              <w:top w:w="80" w:type="dxa"/>
+              <w:start w:w="120" w:type="dxa"/>
+              <w:bottom w:w="80" w:type="dxa"/>
+              <w:end w:w="120" w:type="dxa"/>
+            </w:tcMar>
+          </w:tcPr>
+          <w:p>
+            <w:pPr>
+              <w:jc w:val="left"/>
+            </w:pPr>
+            <w:r/>
+            <w:r>
+              <w:rPr>
+                <w:rFonts w:ascii="Calibri" w:hAnsi="Calibri"/>
+                <w:b/>
+                <w:sz w:val="19"/>
+              </w:rPr>
+              <w:t>工程实现</w:t>
+            </w:r>
+          </w:p>
+        </w:tc>
+        <w:tc>
+          <w:tcPr>
+            <w:tcW w:type="dxa" w:w="4896"/>
+            <w:vAlign w:val="center"/>
+            <w:tcMar>
+              <w:top w:w="80" w:type="dxa"/>
+              <w:start w:w="120" w:type="dxa"/>
+              <w:bottom w:w="80" w:type="dxa"/>
+              <w:end w:w="120" w:type="dxa"/>
+            </w:tcMar>
+          </w:tcPr>
+          <w:p>
+            <w:pPr>
+              <w:jc w:val="left"/>
+            </w:pPr>
+            <w:r/>
+            <w:r>
+              <w:rPr>
+                <w:rFonts w:ascii="Calibri" w:hAnsi="Calibri"/>
+                <w:b w:val="0"/>
+                <w:sz w:val="19"/>
+              </w:rPr>
+              <w:t>一个好 skill 应包含适用场景、步骤、脚本/模板和验收标准。MCP 更偏连接外部工具和数据源，不等于 skill。</w:t>
+            </w:r>
+          </w:p>
+        </w:tc>
+      </w:tr>
+      <w:tr>
+        <w:tc>
+          <w:tcPr>
+            <w:tcW w:type="dxa" w:w="4896"/>
+            <w:vAlign w:val="center"/>
+            <w:tcMar>
+              <w:top w:w="80" w:type="dxa"/>
+              <w:start w:w="120" w:type="dxa"/>
+              <w:bottom w:w="80" w:type="dxa"/>
+              <w:end w:w="120" w:type="dxa"/>
+            </w:tcMar>
+          </w:tcPr>
+          <w:p>
+            <w:pPr>
+              <w:jc w:val="left"/>
+            </w:pPr>
+            <w:r/>
+            <w:r>
+              <w:rPr>
+                <w:rFonts w:ascii="Calibri" w:hAnsi="Calibri"/>
+                <w:b/>
+                <w:sz w:val="19"/>
+              </w:rPr>
+              <w:t>项目映射</w:t>
+            </w:r>
+          </w:p>
+        </w:tc>
+        <w:tc>
+          <w:tcPr>
+            <w:tcW w:type="dxa" w:w="4896"/>
+            <w:vAlign w:val="center"/>
+            <w:tcMar>
+              <w:top w:w="80" w:type="dxa"/>
+              <w:start w:w="120" w:type="dxa"/>
+              <w:bottom w:w="80" w:type="dxa"/>
+              <w:end w:w="120" w:type="dxa"/>
+            </w:tcMar>
+          </w:tcPr>
+          <w:p>
+            <w:pPr>
+              <w:jc w:val="left"/>
+            </w:pPr>
+            <w:r/>
+            <w:r>
+              <w:rPr>
+                <w:rFonts w:ascii="Calibri" w:hAnsi="Calibri"/>
+                <w:b w:val="0"/>
+                <w:sz w:val="19"/>
+              </w:rPr>
+              <w:t>归因流程、报告模板、证据校验规则、bad case 分析流程都可以沉淀成 skill，让 agent 在类似任务中稳定复用。</w:t>
+            </w:r>
+          </w:p>
+        </w:tc>
+      </w:tr>
+      <w:tr>
+        <w:tc>
+          <w:tcPr>
+            <w:tcW w:type="dxa" w:w="4896"/>
+            <w:vAlign w:val="center"/>
+            <w:tcMar>
+              <w:top w:w="80" w:type="dxa"/>
+              <w:start w:w="120" w:type="dxa"/>
+              <w:bottom w:w="80" w:type="dxa"/>
+              <w:end w:w="120" w:type="dxa"/>
+            </w:tcMar>
+          </w:tcPr>
+          <w:p>
+            <w:pPr>
+              <w:jc w:val="left"/>
+            </w:pPr>
+            <w:r/>
+            <w:r>
+              <w:rPr>
+                <w:rFonts w:ascii="Calibri" w:hAnsi="Calibri"/>
+                <w:b/>
+                <w:sz w:val="19"/>
+              </w:rPr>
+              <w:t>常见追问</w:t>
+            </w:r>
+          </w:p>
+        </w:tc>
+        <w:tc>
+          <w:tcPr>
+            <w:tcW w:type="dxa" w:w="4896"/>
+            <w:vAlign w:val="center"/>
+            <w:tcMar>
+              <w:top w:w="80" w:type="dxa"/>
+              <w:start w:w="120" w:type="dxa"/>
+              <w:bottom w:w="80" w:type="dxa"/>
+              <w:end w:w="120" w:type="dxa"/>
+            </w:tcMar>
+          </w:tcPr>
+          <w:p>
+            <w:pPr>
+              <w:jc w:val="left"/>
+            </w:pPr>
+            <w:r/>
+            <w:r>
+              <w:rPr>
+                <w:rFonts w:ascii="Calibri" w:hAnsi="Calibri"/>
+                <w:b w:val="0"/>
+                <w:sz w:val="19"/>
+              </w:rPr>
+              <w:t>Skill 和 prompt 有什么区别？Skill 和 MCP 有什么区别？如何证明一个 skill 真的提高成功率？</w:t>
+            </w:r>
+          </w:p>
+        </w:tc>
+      </w:tr>
+    </w:tbl>
+    <w:p>
+      <w:pPr>
+        <w:pStyle w:val="Heading2"/>
+      </w:pPr>
+      <w:r>
+        <w:t>Stage 6: Browser and Computer-Use Agents</w:t>
+      </w:r>
+    </w:p>
+    <w:tbl>
+      <w:tblPr>
+        <w:tblStyle w:val="TableGrid"/>
+        <w:tblW w:type="auto" w:w="0"/>
+        <w:jc w:val="center"/>
+        <w:tblLayout w:type="fixed"/>
+        <w:tblLook w:firstColumn="1" w:firstRow="1" w:lastColumn="0" w:lastRow="0" w:noHBand="0" w:noVBand="1" w:val="04A0"/>
+      </w:tblPr>
+      <w:tblGrid>
+        <w:gridCol w:w="4896"/>
+        <w:gridCol w:w="4896"/>
+      </w:tblGrid>
+      <w:tr>
+        <w:tc>
+          <w:tcPr>
+            <w:tcW w:type="dxa" w:w="1656"/>
+            <w:vAlign w:val="center"/>
+            <w:tcMar>
+              <w:top w:w="80" w:type="dxa"/>
+              <w:start w:w="120" w:type="dxa"/>
+              <w:bottom w:w="80" w:type="dxa"/>
+              <w:end w:w="120" w:type="dxa"/>
+            </w:tcMar>
+            <w:shd w:fill="E8EEF5"/>
+          </w:tcPr>
+          <w:p>
+            <w:pPr>
+              <w:jc w:val="left"/>
+            </w:pPr>
+            <w:r/>
+            <w:r>
+              <w:rPr>
+                <w:rFonts w:ascii="Calibri" w:hAnsi="Calibri"/>
+                <w:b/>
+                <w:color w:val="1F4D78"/>
+                <w:sz w:val="19"/>
+              </w:rPr>
+              <w:t>维度</w:t>
+            </w:r>
+          </w:p>
+        </w:tc>
+        <w:tc>
+          <w:tcPr>
+            <w:tcW w:type="dxa" w:w="7416"/>
+            <w:vAlign w:val="center"/>
+            <w:tcMar>
+              <w:top w:w="80" w:type="dxa"/>
+              <w:start w:w="120" w:type="dxa"/>
+              <w:bottom w:w="80" w:type="dxa"/>
+              <w:end w:w="120" w:type="dxa"/>
+            </w:tcMar>
+            <w:shd w:fill="E8EEF5"/>
+          </w:tcPr>
+          <w:p>
+            <w:pPr>
+              <w:jc w:val="left"/>
+            </w:pPr>
+            <w:r/>
+            <w:r>
+              <w:rPr>
+                <w:rFonts w:ascii="Calibri" w:hAnsi="Calibri"/>
+                <w:b/>
+                <w:color w:val="1F4D78"/>
+                <w:sz w:val="19"/>
+              </w:rPr>
+              <w:t>面试表达</w:t>
+            </w:r>
+          </w:p>
+        </w:tc>
+      </w:tr>
+      <w:tr>
+        <w:tc>
+          <w:tcPr>
+            <w:tcW w:type="dxa" w:w="4896"/>
+            <w:vAlign w:val="center"/>
+            <w:tcMar>
+              <w:top w:w="80" w:type="dxa"/>
+              <w:start w:w="120" w:type="dxa"/>
+              <w:bottom w:w="80" w:type="dxa"/>
+              <w:end w:w="120" w:type="dxa"/>
+            </w:tcMar>
+          </w:tcPr>
+          <w:p>
+            <w:pPr>
+              <w:jc w:val="left"/>
+            </w:pPr>
+            <w:r/>
+            <w:r>
+              <w:rPr>
+                <w:rFonts w:ascii="Calibri" w:hAnsi="Calibri"/>
+                <w:b/>
+                <w:sz w:val="19"/>
+              </w:rPr>
+              <w:t>学习目标</w:t>
+            </w:r>
+          </w:p>
+        </w:tc>
+        <w:tc>
+          <w:tcPr>
+            <w:tcW w:type="dxa" w:w="4896"/>
+            <w:vAlign w:val="center"/>
+            <w:tcMar>
+              <w:top w:w="80" w:type="dxa"/>
+              <w:start w:w="120" w:type="dxa"/>
+              <w:bottom w:w="80" w:type="dxa"/>
+              <w:end w:w="120" w:type="dxa"/>
+            </w:tcMar>
+          </w:tcPr>
+          <w:p>
+            <w:pPr>
+              <w:jc w:val="left"/>
+            </w:pPr>
+            <w:r/>
+            <w:r>
+              <w:rPr>
+                <w:rFonts w:ascii="Calibri" w:hAnsi="Calibri"/>
+                <w:b w:val="0"/>
+                <w:sz w:val="19"/>
+              </w:rPr>
+              <w:t>理解浏览器/计算机使用型 agent 的观察来源、动作日志、失败恢复和权限边界。</w:t>
+            </w:r>
+          </w:p>
+        </w:tc>
+      </w:tr>
+      <w:tr>
+        <w:tc>
+          <w:tcPr>
+            <w:tcW w:type="dxa" w:w="4896"/>
+            <w:vAlign w:val="center"/>
+            <w:tcMar>
+              <w:top w:w="80" w:type="dxa"/>
+              <w:start w:w="120" w:type="dxa"/>
+              <w:bottom w:w="80" w:type="dxa"/>
+              <w:end w:w="120" w:type="dxa"/>
+            </w:tcMar>
+          </w:tcPr>
+          <w:p>
+            <w:pPr>
+              <w:jc w:val="left"/>
+            </w:pPr>
+            <w:r/>
+            <w:r>
+              <w:rPr>
+                <w:rFonts w:ascii="Calibri" w:hAnsi="Calibri"/>
+                <w:b/>
+                <w:sz w:val="19"/>
+              </w:rPr>
+              <w:t>核心概念</w:t>
+            </w:r>
+          </w:p>
+        </w:tc>
+        <w:tc>
+          <w:tcPr>
+            <w:tcW w:type="dxa" w:w="4896"/>
+            <w:vAlign w:val="center"/>
+            <w:tcMar>
+              <w:top w:w="80" w:type="dxa"/>
+              <w:start w:w="120" w:type="dxa"/>
+              <w:bottom w:w="80" w:type="dxa"/>
+              <w:end w:w="120" w:type="dxa"/>
+            </w:tcMar>
+          </w:tcPr>
+          <w:p>
+            <w:pPr>
+              <w:jc w:val="left"/>
+            </w:pPr>
+            <w:r/>
+            <w:r>
+              <w:rPr>
+                <w:rFonts w:ascii="Calibri" w:hAnsi="Calibri"/>
+                <w:b w:val="0"/>
+                <w:sz w:val="19"/>
+              </w:rPr>
+              <w:t>DOM、screenshot、click/type/navigation、action log、loading/retry、human approval。</w:t>
+            </w:r>
+          </w:p>
+        </w:tc>
+      </w:tr>
+      <w:tr>
+        <w:tc>
+          <w:tcPr>
+            <w:tcW w:type="dxa" w:w="4896"/>
+            <w:vAlign w:val="center"/>
+            <w:tcMar>
+              <w:top w:w="80" w:type="dxa"/>
+              <w:start w:w="120" w:type="dxa"/>
+              <w:bottom w:w="80" w:type="dxa"/>
+              <w:end w:w="120" w:type="dxa"/>
+            </w:tcMar>
+          </w:tcPr>
+          <w:p>
+            <w:pPr>
+              <w:jc w:val="left"/>
+            </w:pPr>
+            <w:r/>
+            <w:r>
+              <w:rPr>
+                <w:rFonts w:ascii="Calibri" w:hAnsi="Calibri"/>
+                <w:b/>
+                <w:sz w:val="19"/>
+              </w:rPr>
+              <w:t>工程实现</w:t>
+            </w:r>
+          </w:p>
+        </w:tc>
+        <w:tc>
+          <w:tcPr>
+            <w:tcW w:type="dxa" w:w="4896"/>
+            <w:vAlign w:val="center"/>
+            <w:tcMar>
+              <w:top w:w="80" w:type="dxa"/>
+              <w:start w:w="120" w:type="dxa"/>
+              <w:bottom w:w="80" w:type="dxa"/>
+              <w:end w:w="120" w:type="dxa"/>
+            </w:tcMar>
+          </w:tcPr>
+          <w:p>
+            <w:pPr>
+              <w:jc w:val="left"/>
+            </w:pPr>
+            <w:r/>
+            <w:r>
+              <w:rPr>
+                <w:rFonts w:ascii="Calibri" w:hAnsi="Calibri"/>
+                <w:b w:val="0"/>
+                <w:sz w:val="19"/>
+              </w:rPr>
+              <w:t>DOM 适合结构化信息提取，截图适合视觉校验，动作日志适合审计。提交、支付、发布、删除等动作必须人工确认。</w:t>
+            </w:r>
+          </w:p>
+        </w:tc>
+      </w:tr>
+      <w:tr>
+        <w:tc>
+          <w:tcPr>
+            <w:tcW w:type="dxa" w:w="4896"/>
+            <w:vAlign w:val="center"/>
+            <w:tcMar>
+              <w:top w:w="80" w:type="dxa"/>
+              <w:start w:w="120" w:type="dxa"/>
+              <w:bottom w:w="80" w:type="dxa"/>
+              <w:end w:w="120" w:type="dxa"/>
+            </w:tcMar>
+          </w:tcPr>
+          <w:p>
+            <w:pPr>
+              <w:jc w:val="left"/>
+            </w:pPr>
+            <w:r/>
+            <w:r>
+              <w:rPr>
+                <w:rFonts w:ascii="Calibri" w:hAnsi="Calibri"/>
+                <w:b/>
+                <w:sz w:val="19"/>
+              </w:rPr>
+              <w:t>项目映射</w:t>
+            </w:r>
+          </w:p>
+        </w:tc>
+        <w:tc>
+          <w:tcPr>
+            <w:tcW w:type="dxa" w:w="4896"/>
+            <w:vAlign w:val="center"/>
+            <w:tcMar>
+              <w:top w:w="80" w:type="dxa"/>
+              <w:start w:w="120" w:type="dxa"/>
+              <w:bottom w:w="80" w:type="dxa"/>
+              <w:end w:w="120" w:type="dxa"/>
+            </w:tcMar>
+          </w:tcPr>
+          <w:p>
+            <w:pPr>
+              <w:jc w:val="left"/>
+            </w:pPr>
+            <w:r/>
+            <w:r>
+              <w:rPr>
+                <w:rFonts w:ascii="Calibri" w:hAnsi="Calibri"/>
+                <w:b w:val="0"/>
+                <w:sz w:val="19"/>
+              </w:rPr>
+              <w:t>如果归因工具涉及后台页面、监控平台或工单系统，浏览器 agent 需要记录动作、截图/DOM 证据，并对外部影响动作设置权限门。</w:t>
+            </w:r>
+          </w:p>
+        </w:tc>
+      </w:tr>
+      <w:tr>
+        <w:tc>
+          <w:tcPr>
+            <w:tcW w:type="dxa" w:w="4896"/>
+            <w:vAlign w:val="center"/>
+            <w:tcMar>
+              <w:top w:w="80" w:type="dxa"/>
+              <w:start w:w="120" w:type="dxa"/>
+              <w:bottom w:w="80" w:type="dxa"/>
+              <w:end w:w="120" w:type="dxa"/>
+            </w:tcMar>
+          </w:tcPr>
+          <w:p>
+            <w:pPr>
+              <w:jc w:val="left"/>
+            </w:pPr>
+            <w:r/>
+            <w:r>
+              <w:rPr>
+                <w:rFonts w:ascii="Calibri" w:hAnsi="Calibri"/>
+                <w:b/>
+                <w:sz w:val="19"/>
+              </w:rPr>
+              <w:t>常见追问</w:t>
+            </w:r>
+          </w:p>
+        </w:tc>
+        <w:tc>
+          <w:tcPr>
+            <w:tcW w:type="dxa" w:w="4896"/>
+            <w:vAlign w:val="center"/>
+            <w:tcMar>
+              <w:top w:w="80" w:type="dxa"/>
+              <w:start w:w="120" w:type="dxa"/>
+              <w:bottom w:w="80" w:type="dxa"/>
+              <w:end w:w="120" w:type="dxa"/>
+            </w:tcMar>
+          </w:tcPr>
+          <w:p>
+            <w:pPr>
+              <w:jc w:val="left"/>
+            </w:pPr>
+            <w:r/>
+            <w:r>
+              <w:rPr>
+                <w:rFonts w:ascii="Calibri" w:hAnsi="Calibri"/>
+                <w:b w:val="0"/>
+                <w:sz w:val="19"/>
+              </w:rPr>
+              <w:t>DOM 和截图分别解决什么问题？页面加载失败怎么办？为什么不能让 agent 自动提交表单？</w:t>
+            </w:r>
+          </w:p>
+        </w:tc>
+      </w:tr>
+    </w:tbl>
+    <w:p>
+      <w:pPr>
+        <w:pStyle w:val="Heading2"/>
+      </w:pPr>
+      <w:r>
+        <w:t>Stage 7: Evaluation, Observability, Safety</w:t>
+      </w:r>
+    </w:p>
+    <w:tbl>
+      <w:tblPr>
+        <w:tblStyle w:val="TableGrid"/>
+        <w:tblW w:type="auto" w:w="0"/>
+        <w:jc w:val="center"/>
+        <w:tblLayout w:type="fixed"/>
+        <w:tblLook w:firstColumn="1" w:firstRow="1" w:lastColumn="0" w:lastRow="0" w:noHBand="0" w:noVBand="1" w:val="04A0"/>
+      </w:tblPr>
+      <w:tblGrid>
+        <w:gridCol w:w="4896"/>
+        <w:gridCol w:w="4896"/>
+      </w:tblGrid>
+      <w:tr>
+        <w:tc>
+          <w:tcPr>
+            <w:tcW w:type="dxa" w:w="1656"/>
+            <w:vAlign w:val="center"/>
+            <w:tcMar>
+              <w:top w:w="80" w:type="dxa"/>
+              <w:start w:w="120" w:type="dxa"/>
+              <w:bottom w:w="80" w:type="dxa"/>
+              <w:end w:w="120" w:type="dxa"/>
+            </w:tcMar>
+            <w:shd w:fill="E8EEF5"/>
+          </w:tcPr>
+          <w:p>
+            <w:pPr>
+              <w:jc w:val="left"/>
+            </w:pPr>
+            <w:r/>
+            <w:r>
+              <w:rPr>
+                <w:rFonts w:ascii="Calibri" w:hAnsi="Calibri"/>
+                <w:b/>
+                <w:color w:val="1F4D78"/>
+                <w:sz w:val="19"/>
+              </w:rPr>
+              <w:t>维度</w:t>
+            </w:r>
+          </w:p>
+        </w:tc>
+        <w:tc>
+          <w:tcPr>
+            <w:tcW w:type="dxa" w:w="7416"/>
+            <w:vAlign w:val="center"/>
+            <w:tcMar>
+              <w:top w:w="80" w:type="dxa"/>
+              <w:start w:w="120" w:type="dxa"/>
+              <w:bottom w:w="80" w:type="dxa"/>
+              <w:end w:w="120" w:type="dxa"/>
+            </w:tcMar>
+            <w:shd w:fill="E8EEF5"/>
+          </w:tcPr>
+          <w:p>
+            <w:pPr>
+              <w:jc w:val="left"/>
+            </w:pPr>
+            <w:r/>
+            <w:r>
+              <w:rPr>
+                <w:rFonts w:ascii="Calibri" w:hAnsi="Calibri"/>
+                <w:b/>
+                <w:color w:val="1F4D78"/>
+                <w:sz w:val="19"/>
+              </w:rPr>
+              <w:t>面试表达</w:t>
+            </w:r>
+          </w:p>
+        </w:tc>
+      </w:tr>
+      <w:tr>
+        <w:tc>
+          <w:tcPr>
+            <w:tcW w:type="dxa" w:w="4896"/>
+            <w:vAlign w:val="center"/>
+            <w:tcMar>
+              <w:top w:w="80" w:type="dxa"/>
+              <w:start w:w="120" w:type="dxa"/>
+              <w:bottom w:w="80" w:type="dxa"/>
+              <w:end w:w="120" w:type="dxa"/>
+            </w:tcMar>
+          </w:tcPr>
+          <w:p>
+            <w:pPr>
+              <w:jc w:val="left"/>
+            </w:pPr>
+            <w:r/>
+            <w:r>
+              <w:rPr>
+                <w:rFonts w:ascii="Calibri" w:hAnsi="Calibri"/>
+                <w:b/>
+                <w:sz w:val="19"/>
+              </w:rPr>
+              <w:t>学习目标</w:t>
+            </w:r>
+          </w:p>
+        </w:tc>
+        <w:tc>
+          <w:tcPr>
+            <w:tcW w:type="dxa" w:w="4896"/>
+            <w:vAlign w:val="center"/>
+            <w:tcMar>
+              <w:top w:w="80" w:type="dxa"/>
+              <w:start w:w="120" w:type="dxa"/>
+              <w:bottom w:w="80" w:type="dxa"/>
+              <w:end w:w="120" w:type="dxa"/>
+            </w:tcMar>
+          </w:tcPr>
+          <w:p>
+            <w:pPr>
+              <w:jc w:val="left"/>
+            </w:pPr>
+            <w:r/>
+            <w:r>
+              <w:rPr>
+                <w:rFonts w:ascii="Calibri" w:hAnsi="Calibri"/>
+                <w:b w:val="0"/>
+                <w:sz w:val="19"/>
+              </w:rPr>
+              <w:t>掌握如何证明 agent 可靠：固定 eval、失败分类、trace 观测、安全边界和成本/延迟指标。</w:t>
+            </w:r>
+          </w:p>
+        </w:tc>
+      </w:tr>
+      <w:tr>
+        <w:tc>
+          <w:tcPr>
+            <w:tcW w:type="dxa" w:w="4896"/>
+            <w:vAlign w:val="center"/>
+            <w:tcMar>
+              <w:top w:w="80" w:type="dxa"/>
+              <w:start w:w="120" w:type="dxa"/>
+              <w:bottom w:w="80" w:type="dxa"/>
+              <w:end w:w="120" w:type="dxa"/>
+            </w:tcMar>
+          </w:tcPr>
+          <w:p>
+            <w:pPr>
+              <w:jc w:val="left"/>
+            </w:pPr>
+            <w:r/>
+            <w:r>
+              <w:rPr>
+                <w:rFonts w:ascii="Calibri" w:hAnsi="Calibri"/>
+                <w:b/>
+                <w:sz w:val="19"/>
+              </w:rPr>
+              <w:t>核心概念</w:t>
+            </w:r>
+          </w:p>
+        </w:tc>
+        <w:tc>
+          <w:tcPr>
+            <w:tcW w:type="dxa" w:w="4896"/>
+            <w:vAlign w:val="center"/>
+            <w:tcMar>
+              <w:top w:w="80" w:type="dxa"/>
+              <w:start w:w="120" w:type="dxa"/>
+              <w:bottom w:w="80" w:type="dxa"/>
+              <w:end w:w="120" w:type="dxa"/>
+            </w:tcMar>
+          </w:tcPr>
+          <w:p>
+            <w:pPr>
+              <w:jc w:val="left"/>
+            </w:pPr>
+            <w:r/>
+            <w:r>
+              <w:rPr>
+                <w:rFonts w:ascii="Calibri" w:hAnsi="Calibri"/>
+                <w:b w:val="0"/>
+                <w:sz w:val="19"/>
+              </w:rPr>
+              <w:t>eval set、expected vs actual、failure category、observability、latency、cost、tool-call count、safety guardrail。</w:t>
+            </w:r>
+          </w:p>
+        </w:tc>
+      </w:tr>
+      <w:tr>
+        <w:tc>
+          <w:tcPr>
+            <w:tcW w:type="dxa" w:w="4896"/>
+            <w:vAlign w:val="center"/>
+            <w:tcMar>
+              <w:top w:w="80" w:type="dxa"/>
+              <w:start w:w="120" w:type="dxa"/>
+              <w:bottom w:w="80" w:type="dxa"/>
+              <w:end w:w="120" w:type="dxa"/>
+            </w:tcMar>
+          </w:tcPr>
+          <w:p>
+            <w:pPr>
+              <w:jc w:val="left"/>
+            </w:pPr>
+            <w:r/>
+            <w:r>
+              <w:rPr>
+                <w:rFonts w:ascii="Calibri" w:hAnsi="Calibri"/>
+                <w:b/>
+                <w:sz w:val="19"/>
+              </w:rPr>
+              <w:t>工程实现</w:t>
+            </w:r>
+          </w:p>
+        </w:tc>
+        <w:tc>
+          <w:tcPr>
+            <w:tcW w:type="dxa" w:w="4896"/>
+            <w:vAlign w:val="center"/>
+            <w:tcMar>
+              <w:top w:w="80" w:type="dxa"/>
+              <w:start w:w="120" w:type="dxa"/>
+              <w:bottom w:w="80" w:type="dxa"/>
+              <w:end w:w="120" w:type="dxa"/>
+            </w:tcMar>
+          </w:tcPr>
+          <w:p>
+            <w:pPr>
+              <w:jc w:val="left"/>
+            </w:pPr>
+            <w:r/>
+            <w:r>
+              <w:rPr>
+                <w:rFonts w:ascii="Calibri" w:hAnsi="Calibri"/>
+                <w:b w:val="0"/>
+                <w:sz w:val="19"/>
+              </w:rPr>
+              <w:t>Eval 表至少包含任务、期望、实际、是否通过、失败分类。Trace 用来定位失败来自 prompt、工具、检索、状态、模型还是生成。</w:t>
+            </w:r>
+          </w:p>
+        </w:tc>
+      </w:tr>
+      <w:tr>
+        <w:tc>
+          <w:tcPr>
+            <w:tcW w:type="dxa" w:w="4896"/>
+            <w:vAlign w:val="center"/>
+            <w:tcMar>
+              <w:top w:w="80" w:type="dxa"/>
+              <w:start w:w="120" w:type="dxa"/>
+              <w:bottom w:w="80" w:type="dxa"/>
+              <w:end w:w="120" w:type="dxa"/>
+            </w:tcMar>
+          </w:tcPr>
+          <w:p>
+            <w:pPr>
+              <w:jc w:val="left"/>
+            </w:pPr>
+            <w:r/>
+            <w:r>
+              <w:rPr>
+                <w:rFonts w:ascii="Calibri" w:hAnsi="Calibri"/>
+                <w:b/>
+                <w:sz w:val="19"/>
+              </w:rPr>
+              <w:t>项目映射</w:t>
+            </w:r>
+          </w:p>
+        </w:tc>
+        <w:tc>
+          <w:tcPr>
+            <w:tcW w:type="dxa" w:w="4896"/>
+            <w:vAlign w:val="center"/>
+            <w:tcMar>
+              <w:top w:w="80" w:type="dxa"/>
+              <w:start w:w="120" w:type="dxa"/>
+              <w:bottom w:w="80" w:type="dxa"/>
+              <w:end w:w="120" w:type="dxa"/>
+            </w:tcMar>
+          </w:tcPr>
+          <w:p>
+            <w:pPr>
+              <w:jc w:val="left"/>
+            </w:pPr>
+            <w:r/>
+            <w:r>
+              <w:rPr>
+                <w:rFonts w:ascii="Calibri" w:hAnsi="Calibri"/>
+                <w:b w:val="0"/>
+                <w:sz w:val="19"/>
+              </w:rPr>
+              <w:t>你的 bad case 分析正对应 Stage 7：用 WorkflowState 和 trace 回看一次归因失败，定位是计划错、工具错、证据不足、反思没触发还是报告生成过度概括。</w:t>
+            </w:r>
+          </w:p>
+        </w:tc>
+      </w:tr>
+      <w:tr>
+        <w:tc>
+          <w:tcPr>
+            <w:tcW w:type="dxa" w:w="4896"/>
+            <w:vAlign w:val="center"/>
+            <w:tcMar>
+              <w:top w:w="80" w:type="dxa"/>
+              <w:start w:w="120" w:type="dxa"/>
+              <w:bottom w:w="80" w:type="dxa"/>
+              <w:end w:w="120" w:type="dxa"/>
+            </w:tcMar>
+          </w:tcPr>
+          <w:p>
+            <w:pPr>
+              <w:jc w:val="left"/>
+            </w:pPr>
+            <w:r/>
+            <w:r>
+              <w:rPr>
+                <w:rFonts w:ascii="Calibri" w:hAnsi="Calibri"/>
+                <w:b/>
+                <w:sz w:val="19"/>
+              </w:rPr>
+              <w:t>常见追问</w:t>
+            </w:r>
+          </w:p>
+        </w:tc>
+        <w:tc>
+          <w:tcPr>
+            <w:tcW w:type="dxa" w:w="4896"/>
+            <w:vAlign w:val="center"/>
+            <w:tcMar>
+              <w:top w:w="80" w:type="dxa"/>
+              <w:start w:w="120" w:type="dxa"/>
+              <w:bottom w:w="80" w:type="dxa"/>
+              <w:end w:w="120" w:type="dxa"/>
+            </w:tcMar>
+          </w:tcPr>
+          <w:p>
+            <w:pPr>
+              <w:jc w:val="left"/>
+            </w:pPr>
+            <w:r/>
+            <w:r>
+              <w:rPr>
+                <w:rFonts w:ascii="Calibri" w:hAnsi="Calibri"/>
+                <w:b w:val="0"/>
+                <w:sz w:val="19"/>
+              </w:rPr>
+              <w:t>怎么证明 agent 变好了？失败分类怎么设计？只靠人工看 demo 有什么问题？如何统计工具调用成本和延迟？</w:t>
+            </w:r>
+          </w:p>
+        </w:tc>
+      </w:tr>
+    </w:tbl>
+    <w:p>
+      <w:pPr>
+        <w:pStyle w:val="Heading2"/>
+      </w:pPr>
+      <w:r>
+        <w:t>Stage 8: Ship a Real Agent</w:t>
+      </w:r>
+    </w:p>
+    <w:tbl>
+      <w:tblPr>
+        <w:tblStyle w:val="TableGrid"/>
+        <w:tblW w:type="auto" w:w="0"/>
+        <w:jc w:val="center"/>
+        <w:tblLayout w:type="fixed"/>
+        <w:tblLook w:firstColumn="1" w:firstRow="1" w:lastColumn="0" w:lastRow="0" w:noHBand="0" w:noVBand="1" w:val="04A0"/>
+      </w:tblPr>
+      <w:tblGrid>
+        <w:gridCol w:w="4896"/>
+        <w:gridCol w:w="4896"/>
+      </w:tblGrid>
+      <w:tr>
+        <w:tc>
+          <w:tcPr>
+            <w:tcW w:type="dxa" w:w="1656"/>
+            <w:vAlign w:val="center"/>
+            <w:tcMar>
+              <w:top w:w="80" w:type="dxa"/>
+              <w:start w:w="120" w:type="dxa"/>
+              <w:bottom w:w="80" w:type="dxa"/>
+              <w:end w:w="120" w:type="dxa"/>
+            </w:tcMar>
+            <w:shd w:fill="E8EEF5"/>
+          </w:tcPr>
+          <w:p>
+            <w:pPr>
+              <w:jc w:val="left"/>
+            </w:pPr>
+            <w:r/>
+            <w:r>
+              <w:rPr>
+                <w:rFonts w:ascii="Calibri" w:hAnsi="Calibri"/>
+                <w:b/>
+                <w:color w:val="1F4D78"/>
+                <w:sz w:val="19"/>
+              </w:rPr>
+              <w:t>维度</w:t>
+            </w:r>
+          </w:p>
+        </w:tc>
+        <w:tc>
+          <w:tcPr>
+            <w:tcW w:type="dxa" w:w="7416"/>
+            <w:vAlign w:val="center"/>
+            <w:tcMar>
+              <w:top w:w="80" w:type="dxa"/>
+              <w:start w:w="120" w:type="dxa"/>
+              <w:bottom w:w="80" w:type="dxa"/>
+              <w:end w:w="120" w:type="dxa"/>
+            </w:tcMar>
+            <w:shd w:fill="E8EEF5"/>
+          </w:tcPr>
+          <w:p>
+            <w:pPr>
+              <w:jc w:val="left"/>
+            </w:pPr>
+            <w:r/>
+            <w:r>
+              <w:rPr>
+                <w:rFonts w:ascii="Calibri" w:hAnsi="Calibri"/>
+                <w:b/>
+                <w:color w:val="1F4D78"/>
+                <w:sz w:val="19"/>
+              </w:rPr>
+              <w:t>面试表达</w:t>
+            </w:r>
+          </w:p>
+        </w:tc>
+      </w:tr>
+      <w:tr>
+        <w:tc>
+          <w:tcPr>
+            <w:tcW w:type="dxa" w:w="4896"/>
+            <w:vAlign w:val="center"/>
+            <w:tcMar>
+              <w:top w:w="80" w:type="dxa"/>
+              <w:start w:w="120" w:type="dxa"/>
+              <w:bottom w:w="80" w:type="dxa"/>
+              <w:end w:w="120" w:type="dxa"/>
+            </w:tcMar>
+          </w:tcPr>
+          <w:p>
+            <w:pPr>
+              <w:jc w:val="left"/>
+            </w:pPr>
+            <w:r/>
+            <w:r>
+              <w:rPr>
+                <w:rFonts w:ascii="Calibri" w:hAnsi="Calibri"/>
+                <w:b/>
+                <w:sz w:val="19"/>
+              </w:rPr>
+              <w:t>学习目标</w:t>
+            </w:r>
+          </w:p>
+        </w:tc>
+        <w:tc>
+          <w:tcPr>
+            <w:tcW w:type="dxa" w:w="4896"/>
+            <w:vAlign w:val="center"/>
+            <w:tcMar>
+              <w:top w:w="80" w:type="dxa"/>
+              <w:start w:w="120" w:type="dxa"/>
+              <w:bottom w:w="80" w:type="dxa"/>
+              <w:end w:w="120" w:type="dxa"/>
+            </w:tcMar>
+          </w:tcPr>
+          <w:p>
+            <w:pPr>
+              <w:jc w:val="left"/>
+            </w:pPr>
+            <w:r/>
+            <w:r>
+              <w:rPr>
+                <w:rFonts w:ascii="Calibri" w:hAnsi="Calibri"/>
+                <w:b w:val="0"/>
+                <w:sz w:val="19"/>
+              </w:rPr>
+              <w:t>把 agent 从 demo 变成可交付系统：明确用户、任务、成功标准、部署形态、日志、权限、回归测试和 README。</w:t>
+            </w:r>
+          </w:p>
+        </w:tc>
+      </w:tr>
+      <w:tr>
+        <w:tc>
+          <w:tcPr>
+            <w:tcW w:type="dxa" w:w="4896"/>
+            <w:vAlign w:val="center"/>
+            <w:tcMar>
+              <w:top w:w="80" w:type="dxa"/>
+              <w:start w:w="120" w:type="dxa"/>
+              <w:bottom w:w="80" w:type="dxa"/>
+              <w:end w:w="120" w:type="dxa"/>
+            </w:tcMar>
+          </w:tcPr>
+          <w:p>
+            <w:pPr>
+              <w:jc w:val="left"/>
+            </w:pPr>
+            <w:r/>
+            <w:r>
+              <w:rPr>
+                <w:rFonts w:ascii="Calibri" w:hAnsi="Calibri"/>
+                <w:b/>
+                <w:sz w:val="19"/>
+              </w:rPr>
+              <w:t>核心概念</w:t>
+            </w:r>
+          </w:p>
+        </w:tc>
+        <w:tc>
+          <w:tcPr>
+            <w:tcW w:type="dxa" w:w="4896"/>
+            <w:vAlign w:val="center"/>
+            <w:tcMar>
+              <w:top w:w="80" w:type="dxa"/>
+              <w:start w:w="120" w:type="dxa"/>
+              <w:bottom w:w="80" w:type="dxa"/>
+              <w:end w:w="120" w:type="dxa"/>
+            </w:tcMar>
+          </w:tcPr>
+          <w:p>
+            <w:pPr>
+              <w:jc w:val="left"/>
+            </w:pPr>
+            <w:r/>
+            <w:r>
+              <w:rPr>
+                <w:rFonts w:ascii="Calibri" w:hAnsi="Calibri"/>
+                <w:b w:val="0"/>
+                <w:sz w:val="19"/>
+              </w:rPr>
+              <w:t>user/task/success criteria、CLI/Web/API、deployment、README、reproducibility、monitoring、rollback。</w:t>
+            </w:r>
+          </w:p>
+        </w:tc>
+      </w:tr>
+      <w:tr>
+        <w:tc>
+          <w:tcPr>
+            <w:tcW w:type="dxa" w:w="4896"/>
+            <w:vAlign w:val="center"/>
+            <w:tcMar>
+              <w:top w:w="80" w:type="dxa"/>
+              <w:start w:w="120" w:type="dxa"/>
+              <w:bottom w:w="80" w:type="dxa"/>
+              <w:end w:w="120" w:type="dxa"/>
+            </w:tcMar>
+          </w:tcPr>
+          <w:p>
+            <w:pPr>
+              <w:jc w:val="left"/>
+            </w:pPr>
+            <w:r/>
+            <w:r>
+              <w:rPr>
+                <w:rFonts w:ascii="Calibri" w:hAnsi="Calibri"/>
+                <w:b/>
+                <w:sz w:val="19"/>
+              </w:rPr>
+              <w:t>工程实现</w:t>
+            </w:r>
+          </w:p>
+        </w:tc>
+        <w:tc>
+          <w:tcPr>
+            <w:tcW w:type="dxa" w:w="4896"/>
+            <w:vAlign w:val="center"/>
+            <w:tcMar>
+              <w:top w:w="80" w:type="dxa"/>
+              <w:start w:w="120" w:type="dxa"/>
+              <w:bottom w:w="80" w:type="dxa"/>
+              <w:end w:w="120" w:type="dxa"/>
+            </w:tcMar>
+          </w:tcPr>
+          <w:p>
+            <w:pPr>
+              <w:jc w:val="left"/>
+            </w:pPr>
+            <w:r/>
+            <w:r>
+              <w:rPr>
+                <w:rFonts w:ascii="Calibri" w:hAnsi="Calibri"/>
+                <w:b w:val="0"/>
+                <w:sz w:val="19"/>
+              </w:rPr>
+              <w:t>交付不是模型能答一次，而是别人能复现、能监控、能回滚、能分析失败、能控制成本和权限。</w:t>
+            </w:r>
+          </w:p>
+        </w:tc>
+      </w:tr>
+      <w:tr>
+        <w:tc>
+          <w:tcPr>
+            <w:tcW w:type="dxa" w:w="4896"/>
+            <w:vAlign w:val="center"/>
+            <w:tcMar>
+              <w:top w:w="80" w:type="dxa"/>
+              <w:start w:w="120" w:type="dxa"/>
+              <w:bottom w:w="80" w:type="dxa"/>
+              <w:end w:w="120" w:type="dxa"/>
+            </w:tcMar>
+          </w:tcPr>
+          <w:p>
+            <w:pPr>
+              <w:jc w:val="left"/>
+            </w:pPr>
+            <w:r/>
+            <w:r>
+              <w:rPr>
+                <w:rFonts w:ascii="Calibri" w:hAnsi="Calibri"/>
+                <w:b/>
+                <w:sz w:val="19"/>
+              </w:rPr>
+              <w:t>项目映射</w:t>
+            </w:r>
+          </w:p>
+        </w:tc>
+        <w:tc>
+          <w:tcPr>
+            <w:tcW w:type="dxa" w:w="4896"/>
+            <w:vAlign w:val="center"/>
+            <w:tcMar>
+              <w:top w:w="80" w:type="dxa"/>
+              <w:start w:w="120" w:type="dxa"/>
+              <w:bottom w:w="80" w:type="dxa"/>
+              <w:end w:w="120" w:type="dxa"/>
+            </w:tcMar>
+          </w:tcPr>
+          <w:p>
+            <w:pPr>
+              <w:jc w:val="left"/>
+            </w:pPr>
+            <w:r/>
+            <w:r>
+              <w:rPr>
+                <w:rFonts w:ascii="Calibri" w:hAnsi="Calibri"/>
+                <w:b w:val="0"/>
+                <w:sz w:val="19"/>
+              </w:rPr>
+              <w:t>你的报告生成链路如果要上线，需要定义异常归因成功标准、人工复核机制、bad case 回流、记忆更新策略和权限边界。</w:t>
+            </w:r>
+          </w:p>
+        </w:tc>
+      </w:tr>
+      <w:tr>
+        <w:tc>
+          <w:tcPr>
+            <w:tcW w:type="dxa" w:w="4896"/>
+            <w:vAlign w:val="center"/>
+            <w:tcMar>
+              <w:top w:w="80" w:type="dxa"/>
+              <w:start w:w="120" w:type="dxa"/>
+              <w:bottom w:w="80" w:type="dxa"/>
+              <w:end w:w="120" w:type="dxa"/>
+            </w:tcMar>
+          </w:tcPr>
+          <w:p>
+            <w:pPr>
+              <w:jc w:val="left"/>
+            </w:pPr>
+            <w:r/>
+            <w:r>
+              <w:rPr>
+                <w:rFonts w:ascii="Calibri" w:hAnsi="Calibri"/>
+                <w:b/>
+                <w:sz w:val="19"/>
+              </w:rPr>
+              <w:t>常见追问</w:t>
+            </w:r>
+          </w:p>
+        </w:tc>
+        <w:tc>
+          <w:tcPr>
+            <w:tcW w:type="dxa" w:w="4896"/>
+            <w:vAlign w:val="center"/>
+            <w:tcMar>
+              <w:top w:w="80" w:type="dxa"/>
+              <w:start w:w="120" w:type="dxa"/>
+              <w:bottom w:w="80" w:type="dxa"/>
+              <w:end w:w="120" w:type="dxa"/>
+            </w:tcMar>
+          </w:tcPr>
+          <w:p>
+            <w:pPr>
+              <w:jc w:val="left"/>
+            </w:pPr>
+            <w:r/>
+            <w:r>
+              <w:rPr>
+                <w:rFonts w:ascii="Calibri" w:hAnsi="Calibri"/>
+                <w:b w:val="0"/>
+                <w:sz w:val="19"/>
+              </w:rPr>
+              <w:t>上线后如何监控？如何回滚错误记忆？如何处理敏感数据？如何让新同事复现实验？</w:t>
+            </w:r>
+          </w:p>
+        </w:tc>
+      </w:tr>
+    </w:tbl>
+    <w:p>
+      <w:pPr>
+        <w:pStyle w:val="Heading1"/>
+      </w:pPr>
+      <w:r>
+        <w:t>三、核心概念速记</w:t>
       </w:r>
     </w:p>
     <w:tbl>
@@ -1227,7 +4027,7 @@
         <w:pStyle w:val="Heading1"/>
       </w:pPr>
       <w:r>
-        <w:t>三、把知识映射到你的简历项目</w:t>
+        <w:t>四、把知识映射到你的简历项目</w:t>
       </w:r>
     </w:p>
     <w:p>
@@ -1583,7 +4383,7 @@
         <w:pStyle w:val="Heading1"/>
       </w:pPr>
       <w:r>
-        <w:t>四、面试高频问答</w:t>
+        <w:t>五、面试高频问答</w:t>
       </w:r>
     </w:p>
     <w:p>
@@ -1669,7 +4469,7 @@
         <w:pStyle w:val="Heading1"/>
       </w:pPr>
       <w:r>
-        <w:t>五、一分钟项目讲述模板</w:t>
+        <w:t>六、一分钟项目讲述模板</w:t>
       </w:r>
     </w:p>
     <w:tbl>
@@ -1719,7 +4519,7 @@
         <w:pStyle w:val="Heading1"/>
       </w:pPr>
       <w:r>
-        <w:t>六、三分钟深入讲述模板</w:t>
+        <w:t>七、三分钟深入讲述模板</w:t>
       </w:r>
     </w:p>
     <w:p>
@@ -1775,7 +4575,7 @@
         <w:pStyle w:val="Heading1"/>
       </w:pPr>
       <w:r>
-        <w:t>七、Stage 1-8 面试追问速答</w:t>
+        <w:t>八、Stage 1-8 面试追问速答</w:t>
       </w:r>
     </w:p>
     <w:tbl>
@@ -2286,7 +5086,7 @@
         <w:pStyle w:val="Heading1"/>
       </w:pPr>
       <w:r>
-        <w:t>八、你要重点记忆的关键词</w:t>
+        <w:t>九、你要重点记忆的关键词</w:t>
       </w:r>
     </w:p>
     <w:p>
@@ -2350,7 +5150,7 @@
         <w:pStyle w:val="Heading1"/>
       </w:pPr>
       <w:r>
-        <w:t>九、面试自检清单</w:t>
+        <w:t>十、面试自检清单</w:t>
       </w:r>
     </w:p>
     <w:p>
@@ -2406,7 +5206,7 @@
         <w:pStyle w:val="Heading1"/>
       </w:pPr>
       <w:r>
-        <w:t>十、扩展面试题库</w:t>
+        <w:t>十一、扩展面试题库</w:t>
       </w:r>
     </w:p>
     <w:tbl>

</xml_diff>